<commit_message>
Freebuff: IMPORTANT TEMPLATE LOGIC CORRECTION
</commit_message>
<xml_diff>
--- a/public/templates/heshiis_kiro_template_v2.docx
+++ b/public/templates/heshiis_kiro_template_v2.docx
@@ -14,13 +14,13 @@
         <w:t xml:space="preserve">Ref/Dpn/HK/{{REF_NUMBER}}</w:t>
       </w:r>
       <w:r>
-        <w:t xml:space="preserve">	</w:t>
+        <w:tab/>
       </w:r>
       <w:r>
         <w:t xml:space="preserve">{{MAALINTA}}</w:t>
       </w:r>
       <w:r>
-        <w:t xml:space="preserve">	</w:t>
+        <w:tab/>
       </w:r>
       <w:r>
         <w:t xml:space="preserve">Taariikh: {{TAARIIKH}}</w:t>
@@ -44,6 +44,18 @@
     </w:p>
     <w:p>
       <w:pPr>
+        <w:spacing w:after="80"/>
+      </w:pPr>
+      <w:r>
+        <w:rPr>
+          <w:b/>
+          <w:bCs/>
+        </w:rPr>
+        <w:t xml:space="preserve">{{IF:KIREYE_HAL}}</w:t>
+      </w:r>
+    </w:p>
+    <w:p>
+      <w:pPr>
         <w:spacing w:after="100" w:before="160"/>
       </w:pPr>
       <w:r>
@@ -57,34 +69,14 @@
     </w:p>
     <w:p>
       <w:pPr>
-        <w:tabs>
-          <w:tab w:val="right" w:pos="9026"/>
-        </w:tabs>
-        <w:spacing w:after="100"/>
-      </w:pPr>
-      <w:r>
-        <w:t xml:space="preserve">❖ </w:t>
-      </w:r>
-      <w:r>
-        <w:t xml:space="preserve">{{KIREYE_MAGAC}}</w:t>
-      </w:r>
-      <w:r>
-        <w:t xml:space="preserve">	Tell </w:t>
-      </w:r>
-      <w:r>
-        <w:t xml:space="preserve">{{KIREYE_TELEFOON}}</w:t>
-      </w:r>
-    </w:p>
-    <w:p>
-      <w:pPr>
-        <w:spacing w:after="80"/>
-      </w:pPr>
-      <w:r>
-        <w:rPr>
-          <w:b/>
-          <w:bCs/>
-        </w:rPr>
-        <w:t xml:space="preserve">{{#KIREYEYAYAAL}}</w:t>
+        <w:spacing w:after="80"/>
+      </w:pPr>
+      <w:r>
+        <w:rPr>
+          <w:b/>
+          <w:bCs/>
+        </w:rPr>
+        <w:t xml:space="preserve">{{IF:KIREEYE_JOOGA}}</w:t>
       </w:r>
     </w:p>
     <w:p>
@@ -95,22 +87,37 @@
         <w:spacing w:after="60"/>
       </w:pPr>
       <w:r>
-        <w:t xml:space="preserve">❖ {{NUMBER}}. {{MAGAC}}</w:t>
-      </w:r>
-      <w:r>
-        <w:t xml:space="preserve">	Tell {{TELEFOON}}</w:t>
-      </w:r>
-    </w:p>
-    <w:p>
-      <w:pPr>
-        <w:spacing w:after="80"/>
-      </w:pPr>
-      <w:r>
-        <w:rPr>
-          <w:b/>
-          <w:bCs/>
-        </w:rPr>
-        <w:t xml:space="preserve">{{IF:WAKIIL}}</w:t>
+        <w:t xml:space="preserve">❖ {{KIREYE_MAGAC}}</w:t>
+      </w:r>
+      <w:r>
+        <w:tab/>
+      </w:r>
+      <w:r>
+        <w:t xml:space="preserve">Tell {{KIREYE_TELEFOON}}</w:t>
+      </w:r>
+    </w:p>
+    <w:p>
+      <w:pPr>
+        <w:spacing w:after="80"/>
+      </w:pPr>
+      <w:r>
+        <w:rPr>
+          <w:b/>
+          <w:bCs/>
+        </w:rPr>
+        <w:t xml:space="preserve">{{END:KIREEYE_JOOGA}}</w:t>
+      </w:r>
+    </w:p>
+    <w:p>
+      <w:pPr>
+        <w:spacing w:after="80"/>
+      </w:pPr>
+      <w:r>
+        <w:rPr>
+          <w:b/>
+          <w:bCs/>
+        </w:rPr>
+        <w:t xml:space="preserve">{{IF:KIREEYE_WAKIIL}}</w:t>
       </w:r>
     </w:p>
     <w:p>
@@ -121,34 +128,49 @@
         <w:spacing w:after="60"/>
       </w:pPr>
       <w:r>
-        <w:t xml:space="preserve">❖ Wakiilka: {{WAKIIL_MAGAC}}</w:t>
-      </w:r>
-      <w:r>
-        <w:t xml:space="preserve">	Tell: {{WAKIIL_TELEFOON}}</w:t>
-      </w:r>
-    </w:p>
-    <w:p>
-      <w:pPr>
-        <w:spacing w:after="80"/>
-      </w:pPr>
-      <w:r>
-        <w:rPr>
-          <w:b/>
-          <w:bCs/>
-        </w:rPr>
-        <w:t xml:space="preserve">{{END:WAKIIL}}</w:t>
-      </w:r>
-    </w:p>
-    <w:p>
-      <w:pPr>
-        <w:spacing w:after="80"/>
-      </w:pPr>
-      <w:r>
-        <w:rPr>
-          <w:b/>
-          <w:bCs/>
-        </w:rPr>
-        <w:t xml:space="preserve">{{/KIREYEYAYAAL}}</w:t>
+        <w:t xml:space="preserve">❖ Wakiilka: {{KIREEYE_WAKIIL_MAGAC}}</w:t>
+      </w:r>
+      <w:r>
+        <w:tab/>
+      </w:r>
+      <w:r>
+        <w:t xml:space="preserve">Tell {{KIREEYE_WAKIIL_TELEFOON}}</w:t>
+      </w:r>
+    </w:p>
+    <w:p>
+      <w:pPr>
+        <w:spacing w:after="80"/>
+      </w:pPr>
+      <w:r>
+        <w:rPr>
+          <w:b/>
+          <w:bCs/>
+        </w:rPr>
+        <w:t xml:space="preserve">{{END:KIREEYE_WAKIIL}}</w:t>
+      </w:r>
+    </w:p>
+    <w:p>
+      <w:pPr>
+        <w:spacing w:after="80"/>
+      </w:pPr>
+      <w:r>
+        <w:rPr>
+          <w:b/>
+          <w:bCs/>
+        </w:rPr>
+        <w:t xml:space="preserve">{{END:KIREYE_HAL}}</w:t>
+      </w:r>
+    </w:p>
+    <w:p>
+      <w:pPr>
+        <w:spacing w:after="80"/>
+      </w:pPr>
+      <w:r>
+        <w:rPr>
+          <w:b/>
+          <w:bCs/>
+        </w:rPr>
+        <w:t xml:space="preserve">{{IF:KIREEYAYAAL_BADAN}}</w:t>
       </w:r>
     </w:p>
     <w:p>
@@ -161,39 +183,19 @@
           <w:bCs/>
           <w:u w:val="single"/>
         </w:rPr>
-        <w:t xml:space="preserve">Magaca Kiraystaha Guriga</w:t>
-      </w:r>
-    </w:p>
-    <w:p>
-      <w:pPr>
-        <w:tabs>
-          <w:tab w:val="right" w:pos="9026"/>
-        </w:tabs>
-        <w:spacing w:after="100"/>
-      </w:pPr>
-      <w:r>
-        <w:t xml:space="preserve">❖ </w:t>
-      </w:r>
-      <w:r>
-        <w:t xml:space="preserve">{{KIRAYSTE_MAGAC}}</w:t>
-      </w:r>
-      <w:r>
-        <w:t xml:space="preserve">	Tell </w:t>
-      </w:r>
-      <w:r>
-        <w:t xml:space="preserve">{{KIRAYSTE_TELEFOON}}</w:t>
-      </w:r>
-    </w:p>
-    <w:p>
-      <w:pPr>
-        <w:spacing w:after="80"/>
-      </w:pPr>
-      <w:r>
-        <w:rPr>
-          <w:b/>
-          <w:bCs/>
-        </w:rPr>
-        <w:t xml:space="preserve">{{#KIRAYSTAYAAL}}</w:t>
+        <w:t xml:space="preserve">Magacyada Kireeyayaasha Guriga</w:t>
+      </w:r>
+    </w:p>
+    <w:p>
+      <w:pPr>
+        <w:spacing w:after="80"/>
+      </w:pPr>
+      <w:r>
+        <w:rPr>
+          <w:b/>
+          <w:bCs/>
+        </w:rPr>
+        <w:t xml:space="preserve">{{#KIREYEYAYAAL}}</w:t>
       </w:r>
     </w:p>
     <w:p>
@@ -207,7 +209,10 @@
         <w:t xml:space="preserve">❖ {{NUMBER}}. {{MAGAC}}</w:t>
       </w:r>
       <w:r>
-        <w:t xml:space="preserve">	Tell {{TELEFOON}}</w:t>
+        <w:tab/>
+      </w:r>
+      <w:r>
+        <w:t xml:space="preserve">Tell {{TELEFOON}}</w:t>
       </w:r>
     </w:p>
     <w:p>
@@ -233,7 +238,10 @@
         <w:t xml:space="preserve">❖ Wakiilka: {{WAKIIL_MAGAC}}</w:t>
       </w:r>
       <w:r>
-        <w:t xml:space="preserve">	Tell: {{WAKIIL_TELEFOON}}</w:t>
+        <w:tab/>
+      </w:r>
+      <w:r>
+        <w:t xml:space="preserve">Tell {{WAKIIL_TELEFOON}}</w:t>
       </w:r>
     </w:p>
     <w:p>
@@ -257,7 +265,257 @@
           <w:b/>
           <w:bCs/>
         </w:rPr>
+        <w:t xml:space="preserve">{{/KIREYEYAYAAL}}</w:t>
+      </w:r>
+    </w:p>
+    <w:p>
+      <w:pPr>
+        <w:spacing w:after="80"/>
+      </w:pPr>
+      <w:r>
+        <w:rPr>
+          <w:b/>
+          <w:bCs/>
+        </w:rPr>
+        <w:t xml:space="preserve">{{END:KIREEYAYAAL_BADAN}}</w:t>
+      </w:r>
+    </w:p>
+    <w:p>
+      <w:pPr>
+        <w:spacing w:after="80"/>
+      </w:pPr>
+      <w:r>
+        <w:rPr>
+          <w:b/>
+          <w:bCs/>
+        </w:rPr>
+        <w:t xml:space="preserve">{{IF:KIRAYSTE_HAL}}</w:t>
+      </w:r>
+    </w:p>
+    <w:p>
+      <w:pPr>
+        <w:spacing w:after="100" w:before="160"/>
+      </w:pPr>
+      <w:r>
+        <w:rPr>
+          <w:b/>
+          <w:bCs/>
+          <w:u w:val="single"/>
+        </w:rPr>
+        <w:t xml:space="preserve">Magaca Kiraystaha Guriga</w:t>
+      </w:r>
+    </w:p>
+    <w:p>
+      <w:pPr>
+        <w:spacing w:after="80"/>
+      </w:pPr>
+      <w:r>
+        <w:rPr>
+          <w:b/>
+          <w:bCs/>
+        </w:rPr>
+        <w:t xml:space="preserve">{{IF:KIRAYSTE_JOOGA}}</w:t>
+      </w:r>
+    </w:p>
+    <w:p>
+      <w:pPr>
+        <w:tabs>
+          <w:tab w:val="right" w:pos="9026"/>
+        </w:tabs>
+        <w:spacing w:after="60"/>
+      </w:pPr>
+      <w:r>
+        <w:t xml:space="preserve">❖ {{KIRAYSTE_MAGAC}}</w:t>
+      </w:r>
+      <w:r>
+        <w:tab/>
+      </w:r>
+      <w:r>
+        <w:t xml:space="preserve">Tell {{KIRAYSTE_TELEFOON}}</w:t>
+      </w:r>
+    </w:p>
+    <w:p>
+      <w:pPr>
+        <w:spacing w:after="80"/>
+      </w:pPr>
+      <w:r>
+        <w:rPr>
+          <w:b/>
+          <w:bCs/>
+        </w:rPr>
+        <w:t xml:space="preserve">{{END:KIRAYSTE_JOOGA}}</w:t>
+      </w:r>
+    </w:p>
+    <w:p>
+      <w:pPr>
+        <w:spacing w:after="80"/>
+      </w:pPr>
+      <w:r>
+        <w:rPr>
+          <w:b/>
+          <w:bCs/>
+        </w:rPr>
+        <w:t xml:space="preserve">{{IF:KIRAYSTE_WAKIIL}}</w:t>
+      </w:r>
+    </w:p>
+    <w:p>
+      <w:pPr>
+        <w:tabs>
+          <w:tab w:val="right" w:pos="9026"/>
+        </w:tabs>
+        <w:spacing w:after="60"/>
+      </w:pPr>
+      <w:r>
+        <w:t xml:space="preserve">❖ Wakiilka: {{KIRAYSTE_WAKIIL_MAGAC}}</w:t>
+      </w:r>
+      <w:r>
+        <w:tab/>
+      </w:r>
+      <w:r>
+        <w:t xml:space="preserve">Tell {{KIRAYSTE_WAKIIL_TELEFOON}}</w:t>
+      </w:r>
+    </w:p>
+    <w:p>
+      <w:pPr>
+        <w:spacing w:after="80"/>
+      </w:pPr>
+      <w:r>
+        <w:rPr>
+          <w:b/>
+          <w:bCs/>
+        </w:rPr>
+        <w:t xml:space="preserve">{{END:KIRAYSTE_WAKIIL}}</w:t>
+      </w:r>
+    </w:p>
+    <w:p>
+      <w:pPr>
+        <w:spacing w:after="80"/>
+      </w:pPr>
+      <w:r>
+        <w:rPr>
+          <w:b/>
+          <w:bCs/>
+        </w:rPr>
+        <w:t xml:space="preserve">{{END:KIRAYSTE_HAL}}</w:t>
+      </w:r>
+    </w:p>
+    <w:p>
+      <w:pPr>
+        <w:spacing w:after="80"/>
+      </w:pPr>
+      <w:r>
+        <w:rPr>
+          <w:b/>
+          <w:bCs/>
+        </w:rPr>
+        <w:t xml:space="preserve">{{IF:KIRAYSTAYAAL_BADAN}}</w:t>
+      </w:r>
+    </w:p>
+    <w:p>
+      <w:pPr>
+        <w:spacing w:after="100" w:before="160"/>
+      </w:pPr>
+      <w:r>
+        <w:rPr>
+          <w:b/>
+          <w:bCs/>
+          <w:u w:val="single"/>
+        </w:rPr>
+        <w:t xml:space="preserve">Magacyada Kiraystayaasha Guriga</w:t>
+      </w:r>
+    </w:p>
+    <w:p>
+      <w:pPr>
+        <w:spacing w:after="80"/>
+      </w:pPr>
+      <w:r>
+        <w:rPr>
+          <w:b/>
+          <w:bCs/>
+        </w:rPr>
+        <w:t xml:space="preserve">{{#KIRAYSTAYAAL}}</w:t>
+      </w:r>
+    </w:p>
+    <w:p>
+      <w:pPr>
+        <w:tabs>
+          <w:tab w:val="right" w:pos="9026"/>
+        </w:tabs>
+        <w:spacing w:after="60"/>
+      </w:pPr>
+      <w:r>
+        <w:t xml:space="preserve">❖ {{NUMBER}}. {{MAGAC}}</w:t>
+      </w:r>
+      <w:r>
+        <w:tab/>
+      </w:r>
+      <w:r>
+        <w:t xml:space="preserve">Tell {{TELEFOON}}</w:t>
+      </w:r>
+    </w:p>
+    <w:p>
+      <w:pPr>
+        <w:spacing w:after="80"/>
+      </w:pPr>
+      <w:r>
+        <w:rPr>
+          <w:b/>
+          <w:bCs/>
+        </w:rPr>
+        <w:t xml:space="preserve">{{IF:WAKIIL}}</w:t>
+      </w:r>
+    </w:p>
+    <w:p>
+      <w:pPr>
+        <w:tabs>
+          <w:tab w:val="right" w:pos="9026"/>
+        </w:tabs>
+        <w:spacing w:after="60"/>
+      </w:pPr>
+      <w:r>
+        <w:t xml:space="preserve">❖ Wakiilka: {{WAKIIL_MAGAC}}</w:t>
+      </w:r>
+      <w:r>
+        <w:tab/>
+      </w:r>
+      <w:r>
+        <w:t xml:space="preserve">Tell {{WAKIIL_TELEFOON}}</w:t>
+      </w:r>
+    </w:p>
+    <w:p>
+      <w:pPr>
+        <w:spacing w:after="80"/>
+      </w:pPr>
+      <w:r>
+        <w:rPr>
+          <w:b/>
+          <w:bCs/>
+        </w:rPr>
+        <w:t xml:space="preserve">{{END:WAKIIL}}</w:t>
+      </w:r>
+    </w:p>
+    <w:p>
+      <w:pPr>
+        <w:spacing w:after="80"/>
+      </w:pPr>
+      <w:r>
+        <w:rPr>
+          <w:b/>
+          <w:bCs/>
+        </w:rPr>
         <w:t xml:space="preserve">{{/KIRAYSTAYAAL}}</w:t>
+      </w:r>
+    </w:p>
+    <w:p>
+      <w:pPr>
+        <w:spacing w:after="80"/>
+      </w:pPr>
+      <w:r>
+        <w:rPr>
+          <w:b/>
+          <w:bCs/>
+        </w:rPr>
+        <w:t xml:space="preserve">{{END:KIRAYSTAYAAL_BADAN}}</w:t>
       </w:r>
     </w:p>
     <w:p>
@@ -454,10 +712,10 @@
         <w:t xml:space="preserve">{{DAMIIN_MAGAC}}</w:t>
       </w:r>
       <w:r>
-        <w:t xml:space="preserve">	Tell </w:t>
-      </w:r>
-      <w:r>
-        <w:t xml:space="preserve">{{DAMIIN_TELEFOON}}</w:t>
+        <w:tab/>
+      </w:r>
+      <w:r>
+        <w:t xml:space="preserve">Tell {{DAMIIN_TELEFOON}}</w:t>
       </w:r>
     </w:p>
     <w:p>
@@ -529,7 +787,10 @@
         <w:t xml:space="preserve">{{NUMBER}}- {{MAGAC}}</w:t>
       </w:r>
       <w:r>
-        <w:t xml:space="preserve">	Tell {{PHONE}}</w:t>
+        <w:tab/>
+      </w:r>
+      <w:r>
+        <w:t xml:space="preserve">Tell {{PHONE}}</w:t>
       </w:r>
     </w:p>
     <w:p>
@@ -724,7 +985,7 @@
           <w:b/>
           <w:bCs/>
         </w:rPr>
-        <w:t xml:space="preserve">{{IF:WAKIIL}}</w:t>
+        <w:t xml:space="preserve">{{IF:KIREEYE_WAKIIL}}</w:t>
       </w:r>
     </w:p>
     <w:p>
@@ -752,7 +1013,7 @@
         <w:t xml:space="preserve">Magac: </w:t>
       </w:r>
       <w:r>
-        <w:t xml:space="preserve">{{WAKIIL_MAGAC}}</w:t>
+        <w:t xml:space="preserve">{{KIREEYE_WAKIIL_MAGAC}}</w:t>
       </w:r>
     </w:p>
     <w:p>
@@ -760,19 +1021,79 @@
         <w:t xml:space="preserve">Tell: </w:t>
       </w:r>
       <w:r>
-        <w:t xml:space="preserve">{{WAKIIL_TELEFOON}}</w:t>
-      </w:r>
-    </w:p>
-    <w:p>
-      <w:pPr>
-        <w:spacing w:after="80"/>
-      </w:pPr>
-      <w:r>
-        <w:rPr>
-          <w:b/>
-          <w:bCs/>
-        </w:rPr>
-        <w:t xml:space="preserve">{{END:WAKIIL}}</w:t>
+        <w:t xml:space="preserve">{{KIREEYE_WAKIIL_TELEFOON}}</w:t>
+      </w:r>
+    </w:p>
+    <w:p>
+      <w:pPr>
+        <w:spacing w:after="80"/>
+      </w:pPr>
+      <w:r>
+        <w:rPr>
+          <w:b/>
+          <w:bCs/>
+        </w:rPr>
+        <w:t xml:space="preserve">{{END:KIREEYE_WAKIIL}}</w:t>
+      </w:r>
+    </w:p>
+    <w:p>
+      <w:pPr>
+        <w:spacing w:after="80"/>
+      </w:pPr>
+      <w:r>
+        <w:rPr>
+          <w:b/>
+          <w:bCs/>
+        </w:rPr>
+        <w:t xml:space="preserve">{{IF:KIRAYSTE_WAKIIL}}</w:t>
+      </w:r>
+    </w:p>
+    <w:p>
+      <w:pPr>
+        <w:spacing w:after="60" w:before="240"/>
+      </w:pPr>
+      <w:r>
+        <w:rPr>
+          <w:b/>
+          <w:bCs/>
+        </w:rPr>
+        <w:t xml:space="preserve">Wakiilka (Kirayste)</w:t>
+      </w:r>
+    </w:p>
+    <w:p>
+      <w:pPr>
+        <w:spacing w:after="60"/>
+      </w:pPr>
+      <w:r>
+        <w:t xml:space="preserve">Saxiix: ____________________</w:t>
+      </w:r>
+    </w:p>
+    <w:p>
+      <w:r>
+        <w:t xml:space="preserve">Magac: </w:t>
+      </w:r>
+      <w:r>
+        <w:t xml:space="preserve">{{KIRAYSTE_WAKIIL_MAGAC}}</w:t>
+      </w:r>
+    </w:p>
+    <w:p>
+      <w:r>
+        <w:t xml:space="preserve">Tell: </w:t>
+      </w:r>
+      <w:r>
+        <w:t xml:space="preserve">{{KIRAYSTE_WAKIIL_TELEFOON}}</w:t>
+      </w:r>
+    </w:p>
+    <w:p>
+      <w:pPr>
+        <w:spacing w:after="80"/>
+      </w:pPr>
+      <w:r>
+        <w:rPr>
+          <w:b/>
+          <w:bCs/>
+        </w:rPr>
+        <w:t xml:space="preserve">{{END:KIRAYSTE_WAKIIL}}</w:t>
       </w:r>
     </w:p>
     <w:sectPr>

</xml_diff>

<commit_message>
Freebuff: FINAL LOGIC REVIEW — DO NOT REBUILD THE SYSTEM
</commit_message>
<xml_diff>
--- a/public/templates/heshiis_kiro_template_v2.docx
+++ b/public/templates/heshiis_kiro_template_v2.docx
@@ -200,6 +200,18 @@
     </w:p>
     <w:p>
       <w:pPr>
+        <w:spacing w:after="80"/>
+      </w:pPr>
+      <w:r>
+        <w:rPr>
+          <w:b/>
+          <w:bCs/>
+        </w:rPr>
+        <w:t xml:space="preserve">{{IF:JOOGA}}</w:t>
+      </w:r>
+    </w:p>
+    <w:p>
+      <w:pPr>
         <w:tabs>
           <w:tab w:val="right" w:pos="9026"/>
         </w:tabs>
@@ -224,6 +236,18 @@
           <w:b/>
           <w:bCs/>
         </w:rPr>
+        <w:t xml:space="preserve">{{END:JOOGA}}</w:t>
+      </w:r>
+    </w:p>
+    <w:p>
+      <w:pPr>
+        <w:spacing w:after="80"/>
+      </w:pPr>
+      <w:r>
+        <w:rPr>
+          <w:b/>
+          <w:bCs/>
+        </w:rPr>
         <w:t xml:space="preserve">{{IF:WAKIIL}}</w:t>
       </w:r>
     </w:p>
@@ -235,7 +259,7 @@
         <w:spacing w:after="60"/>
       </w:pPr>
       <w:r>
-        <w:t xml:space="preserve">❖ Wakiilka: {{WAKIIL_MAGAC}}</w:t>
+        <w:t xml:space="preserve">❖ {{NUMBER}}. Wakiilka: {{WAKIIL_MAGAC}}</w:t>
       </w:r>
       <w:r>
         <w:tab/>
@@ -438,6 +462,18 @@
     </w:p>
     <w:p>
       <w:pPr>
+        <w:spacing w:after="80"/>
+      </w:pPr>
+      <w:r>
+        <w:rPr>
+          <w:b/>
+          <w:bCs/>
+        </w:rPr>
+        <w:t xml:space="preserve">{{IF:JOOGA}}</w:t>
+      </w:r>
+    </w:p>
+    <w:p>
+      <w:pPr>
         <w:tabs>
           <w:tab w:val="right" w:pos="9026"/>
         </w:tabs>
@@ -462,6 +498,18 @@
           <w:b/>
           <w:bCs/>
         </w:rPr>
+        <w:t xml:space="preserve">{{END:JOOGA}}</w:t>
+      </w:r>
+    </w:p>
+    <w:p>
+      <w:pPr>
+        <w:spacing w:after="80"/>
+      </w:pPr>
+      <w:r>
+        <w:rPr>
+          <w:b/>
+          <w:bCs/>
+        </w:rPr>
         <w:t xml:space="preserve">{{IF:WAKIIL}}</w:t>
       </w:r>
     </w:p>
@@ -473,7 +521,7 @@
         <w:spacing w:after="60"/>
       </w:pPr>
       <w:r>
-        <w:t xml:space="preserve">❖ Wakiilka: {{WAKIIL_MAGAC}}</w:t>
+        <w:t xml:space="preserve">❖ {{NUMBER}}. Wakiilka: {{WAKIIL_MAGAC}}</w:t>
       </w:r>
       <w:r>
         <w:tab/>
@@ -572,23 +620,32 @@
     </w:p>
     <w:p>
       <w:pPr>
-        <w:spacing w:after="80"/>
-      </w:pPr>
-      <w:r>
-        <w:rPr>
-          <w:b/>
-          <w:bCs/>
-        </w:rPr>
-        <w:t xml:space="preserve">{{IF:KIRO_XIDHAN}}</w:t>
-      </w:r>
-    </w:p>
-    <w:p>
-      <w:pPr>
         <w:spacing w:after="120" w:line="300"/>
         <w:jc w:val="both"/>
       </w:pPr>
       <w:r>
-        <w:t xml:space="preserve">4. Habka bixinta kiradu waa {{HABKA_BIXINTA}}. Mudada kiradu wuu dhammaan doonaa {{TAARIIKH_DHAMMAAD}}.</w:t>
+        <w:t xml:space="preserve">4. Habka bixinta kiradu waa {{HABKA_BIXINTA}}.</w:t>
+      </w:r>
+    </w:p>
+    <w:p>
+      <w:pPr>
+        <w:spacing w:after="80"/>
+      </w:pPr>
+      <w:r>
+        <w:rPr>
+          <w:b/>
+          <w:bCs/>
+        </w:rPr>
+        <w:t xml:space="preserve">{{IF:KIRO_XIDHAN}}</w:t>
+      </w:r>
+    </w:p>
+    <w:p>
+      <w:pPr>
+        <w:spacing w:after="120" w:line="300"/>
+        <w:jc w:val="both"/>
+      </w:pPr>
+      <w:r>
+        <w:t xml:space="preserve">Taariikhda uu heshiisku ku dhammaanayo waa {{TAARIIKH_DHAMMAAD}}.</w:t>
       </w:r>
     </w:p>
     <w:p>
@@ -846,6 +903,30 @@
     </w:p>
     <w:p>
       <w:pPr>
+        <w:spacing w:after="80"/>
+      </w:pPr>
+      <w:r>
+        <w:rPr>
+          <w:b/>
+          <w:bCs/>
+        </w:rPr>
+        <w:t xml:space="preserve">{{IF:KIREYE_HAL}}</w:t>
+      </w:r>
+    </w:p>
+    <w:p>
+      <w:pPr>
+        <w:spacing w:after="80"/>
+      </w:pPr>
+      <w:r>
+        <w:rPr>
+          <w:b/>
+          <w:bCs/>
+        </w:rPr>
+        <w:t xml:space="preserve">{{IF:KIREEYE_JOOGA}}</w:t>
+      </w:r>
+    </w:p>
+    <w:p>
+      <w:pPr>
         <w:spacing w:after="60" w:before="240"/>
       </w:pPr>
       <w:r>
@@ -882,6 +963,30 @@
     </w:p>
     <w:p>
       <w:pPr>
+        <w:spacing w:after="80"/>
+      </w:pPr>
+      <w:r>
+        <w:rPr>
+          <w:b/>
+          <w:bCs/>
+        </w:rPr>
+        <w:t xml:space="preserve">{{END:KIREEYE_JOOGA}}</w:t>
+      </w:r>
+    </w:p>
+    <w:p>
+      <w:pPr>
+        <w:spacing w:after="80"/>
+      </w:pPr>
+      <w:r>
+        <w:rPr>
+          <w:b/>
+          <w:bCs/>
+        </w:rPr>
+        <w:t xml:space="preserve">{{IF:KIREEYE_WAKIIL}}</w:t>
+      </w:r>
+    </w:p>
+    <w:p>
+      <w:pPr>
         <w:spacing w:after="60" w:before="240"/>
       </w:pPr>
       <w:r>
@@ -889,6 +994,198 @@
           <w:b/>
           <w:bCs/>
         </w:rPr>
+        <w:t xml:space="preserve">Wakiilka (oo matalaya Kireeyaha)</w:t>
+      </w:r>
+    </w:p>
+    <w:p>
+      <w:pPr>
+        <w:spacing w:after="60"/>
+      </w:pPr>
+      <w:r>
+        <w:t xml:space="preserve">Saxiix: ____________________</w:t>
+      </w:r>
+    </w:p>
+    <w:p>
+      <w:r>
+        <w:t xml:space="preserve">Magac: </w:t>
+      </w:r>
+      <w:r>
+        <w:t xml:space="preserve">{{KIREEYE_WAKIIL_MAGAC}}</w:t>
+      </w:r>
+    </w:p>
+    <w:p>
+      <w:r>
+        <w:t xml:space="preserve">Tell: </w:t>
+      </w:r>
+      <w:r>
+        <w:t xml:space="preserve">{{KIREEYE_WAKIIL_TELEFOON}}</w:t>
+      </w:r>
+    </w:p>
+    <w:p>
+      <w:pPr>
+        <w:spacing w:after="80"/>
+      </w:pPr>
+      <w:r>
+        <w:rPr>
+          <w:b/>
+          <w:bCs/>
+        </w:rPr>
+        <w:t xml:space="preserve">{{END:KIREEYE_WAKIIL}}</w:t>
+      </w:r>
+    </w:p>
+    <w:p>
+      <w:pPr>
+        <w:spacing w:after="80"/>
+      </w:pPr>
+      <w:r>
+        <w:rPr>
+          <w:b/>
+          <w:bCs/>
+        </w:rPr>
+        <w:t xml:space="preserve">{{END:KIREYE_HAL}}</w:t>
+      </w:r>
+    </w:p>
+    <w:p>
+      <w:pPr>
+        <w:spacing w:after="80"/>
+      </w:pPr>
+      <w:r>
+        <w:rPr>
+          <w:b/>
+          <w:bCs/>
+        </w:rPr>
+        <w:t xml:space="preserve">{{IF:KIREEYAYAAL_BADAN}}</w:t>
+      </w:r>
+    </w:p>
+    <w:p>
+      <w:pPr>
+        <w:spacing w:after="80"/>
+      </w:pPr>
+      <w:r>
+        <w:rPr>
+          <w:b/>
+          <w:bCs/>
+        </w:rPr>
+        <w:t xml:space="preserve">{{#KIREYEYAYAAL}}</w:t>
+      </w:r>
+    </w:p>
+    <w:p>
+      <w:pPr>
+        <w:spacing w:after="80"/>
+      </w:pPr>
+      <w:r>
+        <w:rPr>
+          <w:b/>
+          <w:bCs/>
+        </w:rPr>
+        <w:t xml:space="preserve">{{IF:JOOGA}}</w:t>
+      </w:r>
+    </w:p>
+    <w:p>
+      <w:pPr>
+        <w:spacing w:after="60" w:before="240"/>
+      </w:pPr>
+      <w:r>
+        <w:rPr>
+          <w:b/>
+          <w:bCs/>
+        </w:rPr>
+        <w:t xml:space="preserve">Kireeye {{NUMBER}}</w:t>
+      </w:r>
+    </w:p>
+    <w:p>
+      <w:pPr>
+        <w:spacing w:after="60"/>
+      </w:pPr>
+      <w:r>
+        <w:t xml:space="preserve">Saxiix: ____________________</w:t>
+      </w:r>
+    </w:p>
+    <w:p>
+      <w:r>
+        <w:t xml:space="preserve">Magac: </w:t>
+      </w:r>
+      <w:r>
+        <w:t xml:space="preserve">{{MAGAC}}</w:t>
+      </w:r>
+    </w:p>
+    <w:p>
+      <w:r>
+        <w:t xml:space="preserve">Tell: </w:t>
+      </w:r>
+      <w:r>
+        <w:t xml:space="preserve">{{TELEFOON}}</w:t>
+      </w:r>
+    </w:p>
+    <w:p>
+      <w:pPr>
+        <w:spacing w:after="80"/>
+      </w:pPr>
+      <w:r>
+        <w:rPr>
+          <w:b/>
+          <w:bCs/>
+        </w:rPr>
+        <w:t xml:space="preserve">{{END:JOOGA}}</w:t>
+      </w:r>
+    </w:p>
+    <w:p>
+      <w:pPr>
+        <w:spacing w:after="80"/>
+      </w:pPr>
+      <w:r>
+        <w:rPr>
+          <w:b/>
+          <w:bCs/>
+        </w:rPr>
+        <w:t xml:space="preserve">{{/KIREYEYAYAAL}}</w:t>
+      </w:r>
+    </w:p>
+    <w:p>
+      <w:pPr>
+        <w:spacing w:after="80"/>
+      </w:pPr>
+      <w:r>
+        <w:rPr>
+          <w:b/>
+          <w:bCs/>
+        </w:rPr>
+        <w:t xml:space="preserve">{{END:KIREEYAYAAL_BADAN}}</w:t>
+      </w:r>
+    </w:p>
+    <w:p>
+      <w:pPr>
+        <w:spacing w:after="80"/>
+      </w:pPr>
+      <w:r>
+        <w:rPr>
+          <w:b/>
+          <w:bCs/>
+        </w:rPr>
+        <w:t xml:space="preserve">{{IF:KIRAYSTE_HAL}}</w:t>
+      </w:r>
+    </w:p>
+    <w:p>
+      <w:pPr>
+        <w:spacing w:after="80"/>
+      </w:pPr>
+      <w:r>
+        <w:rPr>
+          <w:b/>
+          <w:bCs/>
+        </w:rPr>
+        <w:t xml:space="preserve">{{IF:KIRAYSTE_JOOGA}}</w:t>
+      </w:r>
+    </w:p>
+    <w:p>
+      <w:pPr>
+        <w:spacing w:after="60" w:before="240"/>
+      </w:pPr>
+      <w:r>
+        <w:rPr>
+          <w:b/>
+          <w:bCs/>
+        </w:rPr>
         <w:t xml:space="preserve">Kirayste</w:t>
       </w:r>
     </w:p>
@@ -925,6 +1222,366 @@
           <w:b/>
           <w:bCs/>
         </w:rPr>
+        <w:t xml:space="preserve">{{END:KIRAYSTE_JOOGA}}</w:t>
+      </w:r>
+    </w:p>
+    <w:p>
+      <w:pPr>
+        <w:spacing w:after="80"/>
+      </w:pPr>
+      <w:r>
+        <w:rPr>
+          <w:b/>
+          <w:bCs/>
+        </w:rPr>
+        <w:t xml:space="preserve">{{IF:KIRAYSTE_WAKIIL}}</w:t>
+      </w:r>
+    </w:p>
+    <w:p>
+      <w:pPr>
+        <w:spacing w:after="60" w:before="240"/>
+      </w:pPr>
+      <w:r>
+        <w:rPr>
+          <w:b/>
+          <w:bCs/>
+        </w:rPr>
+        <w:t xml:space="preserve">Wakiilka (oo matalaya Kiraystaha)</w:t>
+      </w:r>
+    </w:p>
+    <w:p>
+      <w:pPr>
+        <w:spacing w:after="60"/>
+      </w:pPr>
+      <w:r>
+        <w:t xml:space="preserve">Saxiix: ____________________</w:t>
+      </w:r>
+    </w:p>
+    <w:p>
+      <w:r>
+        <w:t xml:space="preserve">Magac: </w:t>
+      </w:r>
+      <w:r>
+        <w:t xml:space="preserve">{{KIRAYSTE_WAKIIL_MAGAC}}</w:t>
+      </w:r>
+    </w:p>
+    <w:p>
+      <w:r>
+        <w:t xml:space="preserve">Tell: </w:t>
+      </w:r>
+      <w:r>
+        <w:t xml:space="preserve">{{KIRAYSTE_WAKIIL_TELEFOON}}</w:t>
+      </w:r>
+    </w:p>
+    <w:p>
+      <w:pPr>
+        <w:spacing w:after="80"/>
+      </w:pPr>
+      <w:r>
+        <w:rPr>
+          <w:b/>
+          <w:bCs/>
+        </w:rPr>
+        <w:t xml:space="preserve">{{END:KIRAYSTE_WAKIIL}}</w:t>
+      </w:r>
+    </w:p>
+    <w:p>
+      <w:pPr>
+        <w:spacing w:after="80"/>
+      </w:pPr>
+      <w:r>
+        <w:rPr>
+          <w:b/>
+          <w:bCs/>
+        </w:rPr>
+        <w:t xml:space="preserve">{{END:KIRAYSTE_HAL}}</w:t>
+      </w:r>
+    </w:p>
+    <w:p>
+      <w:pPr>
+        <w:spacing w:after="80"/>
+      </w:pPr>
+      <w:r>
+        <w:rPr>
+          <w:b/>
+          <w:bCs/>
+        </w:rPr>
+        <w:t xml:space="preserve">{{IF:KIRAYSTAYAAL_BADAN}}</w:t>
+      </w:r>
+    </w:p>
+    <w:p>
+      <w:pPr>
+        <w:spacing w:after="80"/>
+      </w:pPr>
+      <w:r>
+        <w:rPr>
+          <w:b/>
+          <w:bCs/>
+        </w:rPr>
+        <w:t xml:space="preserve">{{#KIRAYSTAYAAL}}</w:t>
+      </w:r>
+    </w:p>
+    <w:p>
+      <w:pPr>
+        <w:spacing w:after="80"/>
+      </w:pPr>
+      <w:r>
+        <w:rPr>
+          <w:b/>
+          <w:bCs/>
+        </w:rPr>
+        <w:t xml:space="preserve">{{IF:JOOGA}}</w:t>
+      </w:r>
+    </w:p>
+    <w:p>
+      <w:pPr>
+        <w:spacing w:after="60" w:before="240"/>
+      </w:pPr>
+      <w:r>
+        <w:rPr>
+          <w:b/>
+          <w:bCs/>
+        </w:rPr>
+        <w:t xml:space="preserve">Kirayste {{NUMBER}}</w:t>
+      </w:r>
+    </w:p>
+    <w:p>
+      <w:pPr>
+        <w:spacing w:after="60"/>
+      </w:pPr>
+      <w:r>
+        <w:t xml:space="preserve">Saxiix: ____________________</w:t>
+      </w:r>
+    </w:p>
+    <w:p>
+      <w:r>
+        <w:t xml:space="preserve">Magac: </w:t>
+      </w:r>
+      <w:r>
+        <w:t xml:space="preserve">{{MAGAC}}</w:t>
+      </w:r>
+    </w:p>
+    <w:p>
+      <w:r>
+        <w:t xml:space="preserve">Tell: </w:t>
+      </w:r>
+      <w:r>
+        <w:t xml:space="preserve">{{TELEFOON}}</w:t>
+      </w:r>
+    </w:p>
+    <w:p>
+      <w:pPr>
+        <w:spacing w:after="80"/>
+      </w:pPr>
+      <w:r>
+        <w:rPr>
+          <w:b/>
+          <w:bCs/>
+        </w:rPr>
+        <w:t xml:space="preserve">{{END:JOOGA}}</w:t>
+      </w:r>
+    </w:p>
+    <w:p>
+      <w:pPr>
+        <w:spacing w:after="80"/>
+      </w:pPr>
+      <w:r>
+        <w:rPr>
+          <w:b/>
+          <w:bCs/>
+        </w:rPr>
+        <w:t xml:space="preserve">{{/KIRAYSTAYAAL}}</w:t>
+      </w:r>
+    </w:p>
+    <w:p>
+      <w:pPr>
+        <w:spacing w:after="80"/>
+      </w:pPr>
+      <w:r>
+        <w:rPr>
+          <w:b/>
+          <w:bCs/>
+        </w:rPr>
+        <w:t xml:space="preserve">{{END:KIRAYSTAYAAL_BADAN}}</w:t>
+      </w:r>
+    </w:p>
+    <w:p>
+      <w:pPr>
+        <w:spacing w:after="80"/>
+      </w:pPr>
+      <w:r>
+        <w:rPr>
+          <w:b/>
+          <w:bCs/>
+        </w:rPr>
+        <w:t xml:space="preserve">{{IF:KIREEYAYAAL_BADAN}}</w:t>
+      </w:r>
+    </w:p>
+    <w:p>
+      <w:pPr>
+        <w:spacing w:after="80"/>
+      </w:pPr>
+      <w:r>
+        <w:rPr>
+          <w:b/>
+          <w:bCs/>
+        </w:rPr>
+        <w:t xml:space="preserve">{{IF:KIREEYE_WAKIIL}}</w:t>
+      </w:r>
+    </w:p>
+    <w:p>
+      <w:pPr>
+        <w:spacing w:after="60" w:before="240"/>
+      </w:pPr>
+      <w:r>
+        <w:rPr>
+          <w:b/>
+          <w:bCs/>
+        </w:rPr>
+        <w:t xml:space="preserve">Wakiilka (oo matalaya Kireeyada)</w:t>
+      </w:r>
+    </w:p>
+    <w:p>
+      <w:pPr>
+        <w:spacing w:after="60"/>
+      </w:pPr>
+      <w:r>
+        <w:t xml:space="preserve">Saxiix: ____________________</w:t>
+      </w:r>
+    </w:p>
+    <w:p>
+      <w:r>
+        <w:t xml:space="preserve">Magac: </w:t>
+      </w:r>
+      <w:r>
+        <w:t xml:space="preserve">{{KIREEYE_WAKIIL_MAGAC}}</w:t>
+      </w:r>
+    </w:p>
+    <w:p>
+      <w:r>
+        <w:t xml:space="preserve">Tell: </w:t>
+      </w:r>
+      <w:r>
+        <w:t xml:space="preserve">{{KIREEYE_WAKIIL_TELEFOON}}</w:t>
+      </w:r>
+    </w:p>
+    <w:p>
+      <w:pPr>
+        <w:spacing w:after="80"/>
+      </w:pPr>
+      <w:r>
+        <w:rPr>
+          <w:b/>
+          <w:bCs/>
+        </w:rPr>
+        <w:t xml:space="preserve">{{END:KIREEYE_WAKIIL}}</w:t>
+      </w:r>
+    </w:p>
+    <w:p>
+      <w:pPr>
+        <w:spacing w:after="80"/>
+      </w:pPr>
+      <w:r>
+        <w:rPr>
+          <w:b/>
+          <w:bCs/>
+        </w:rPr>
+        <w:t xml:space="preserve">{{END:KIREEYAYAAL_BADAN}}</w:t>
+      </w:r>
+    </w:p>
+    <w:p>
+      <w:pPr>
+        <w:spacing w:after="80"/>
+      </w:pPr>
+      <w:r>
+        <w:rPr>
+          <w:b/>
+          <w:bCs/>
+        </w:rPr>
+        <w:t xml:space="preserve">{{IF:KIRAYSTAYAAL_BADAN}}</w:t>
+      </w:r>
+    </w:p>
+    <w:p>
+      <w:pPr>
+        <w:spacing w:after="80"/>
+      </w:pPr>
+      <w:r>
+        <w:rPr>
+          <w:b/>
+          <w:bCs/>
+        </w:rPr>
+        <w:t xml:space="preserve">{{IF:KIRAYSTE_WAKIIL}}</w:t>
+      </w:r>
+    </w:p>
+    <w:p>
+      <w:pPr>
+        <w:spacing w:after="60" w:before="240"/>
+      </w:pPr>
+      <w:r>
+        <w:rPr>
+          <w:b/>
+          <w:bCs/>
+        </w:rPr>
+        <w:t xml:space="preserve">Wakiilka (oo matalaya Kiraystada)</w:t>
+      </w:r>
+    </w:p>
+    <w:p>
+      <w:pPr>
+        <w:spacing w:after="60"/>
+      </w:pPr>
+      <w:r>
+        <w:t xml:space="preserve">Saxiix: ____________________</w:t>
+      </w:r>
+    </w:p>
+    <w:p>
+      <w:r>
+        <w:t xml:space="preserve">Magac: </w:t>
+      </w:r>
+      <w:r>
+        <w:t xml:space="preserve">{{KIRAYSTE_WAKIIL_MAGAC}}</w:t>
+      </w:r>
+    </w:p>
+    <w:p>
+      <w:r>
+        <w:t xml:space="preserve">Tell: </w:t>
+      </w:r>
+      <w:r>
+        <w:t xml:space="preserve">{{KIRAYSTE_WAKIIL_TELEFOON}}</w:t>
+      </w:r>
+    </w:p>
+    <w:p>
+      <w:pPr>
+        <w:spacing w:after="80"/>
+      </w:pPr>
+      <w:r>
+        <w:rPr>
+          <w:b/>
+          <w:bCs/>
+        </w:rPr>
+        <w:t xml:space="preserve">{{END:KIRAYSTE_WAKIIL}}</w:t>
+      </w:r>
+    </w:p>
+    <w:p>
+      <w:pPr>
+        <w:spacing w:after="80"/>
+      </w:pPr>
+      <w:r>
+        <w:rPr>
+          <w:b/>
+          <w:bCs/>
+        </w:rPr>
+        <w:t xml:space="preserve">{{END:KIRAYSTAYAAL_BADAN}}</w:t>
+      </w:r>
+    </w:p>
+    <w:p>
+      <w:pPr>
+        <w:spacing w:after="80"/>
+      </w:pPr>
+      <w:r>
+        <w:rPr>
+          <w:b/>
+          <w:bCs/>
+        </w:rPr>
         <w:t xml:space="preserve">{{IF:DAMIIN_HAA}}</w:t>
       </w:r>
     </w:p>
@@ -974,126 +1631,6 @@
           <w:bCs/>
         </w:rPr>
         <w:t xml:space="preserve">{{END:DAMIIN_HAA}}</w:t>
-      </w:r>
-    </w:p>
-    <w:p>
-      <w:pPr>
-        <w:spacing w:after="80"/>
-      </w:pPr>
-      <w:r>
-        <w:rPr>
-          <w:b/>
-          <w:bCs/>
-        </w:rPr>
-        <w:t xml:space="preserve">{{IF:KIREEYE_WAKIIL}}</w:t>
-      </w:r>
-    </w:p>
-    <w:p>
-      <w:pPr>
-        <w:spacing w:after="60" w:before="240"/>
-      </w:pPr>
-      <w:r>
-        <w:rPr>
-          <w:b/>
-          <w:bCs/>
-        </w:rPr>
-        <w:t xml:space="preserve">Wakiilka</w:t>
-      </w:r>
-    </w:p>
-    <w:p>
-      <w:pPr>
-        <w:spacing w:after="60"/>
-      </w:pPr>
-      <w:r>
-        <w:t xml:space="preserve">Saxiix: ____________________</w:t>
-      </w:r>
-    </w:p>
-    <w:p>
-      <w:r>
-        <w:t xml:space="preserve">Magac: </w:t>
-      </w:r>
-      <w:r>
-        <w:t xml:space="preserve">{{KIREEYE_WAKIIL_MAGAC}}</w:t>
-      </w:r>
-    </w:p>
-    <w:p>
-      <w:r>
-        <w:t xml:space="preserve">Tell: </w:t>
-      </w:r>
-      <w:r>
-        <w:t xml:space="preserve">{{KIREEYE_WAKIIL_TELEFOON}}</w:t>
-      </w:r>
-    </w:p>
-    <w:p>
-      <w:pPr>
-        <w:spacing w:after="80"/>
-      </w:pPr>
-      <w:r>
-        <w:rPr>
-          <w:b/>
-          <w:bCs/>
-        </w:rPr>
-        <w:t xml:space="preserve">{{END:KIREEYE_WAKIIL}}</w:t>
-      </w:r>
-    </w:p>
-    <w:p>
-      <w:pPr>
-        <w:spacing w:after="80"/>
-      </w:pPr>
-      <w:r>
-        <w:rPr>
-          <w:b/>
-          <w:bCs/>
-        </w:rPr>
-        <w:t xml:space="preserve">{{IF:KIRAYSTE_WAKIIL}}</w:t>
-      </w:r>
-    </w:p>
-    <w:p>
-      <w:pPr>
-        <w:spacing w:after="60" w:before="240"/>
-      </w:pPr>
-      <w:r>
-        <w:rPr>
-          <w:b/>
-          <w:bCs/>
-        </w:rPr>
-        <w:t xml:space="preserve">Wakiilka (Kirayste)</w:t>
-      </w:r>
-    </w:p>
-    <w:p>
-      <w:pPr>
-        <w:spacing w:after="60"/>
-      </w:pPr>
-      <w:r>
-        <w:t xml:space="preserve">Saxiix: ____________________</w:t>
-      </w:r>
-    </w:p>
-    <w:p>
-      <w:r>
-        <w:t xml:space="preserve">Magac: </w:t>
-      </w:r>
-      <w:r>
-        <w:t xml:space="preserve">{{KIRAYSTE_WAKIIL_MAGAC}}</w:t>
-      </w:r>
-    </w:p>
-    <w:p>
-      <w:r>
-        <w:t xml:space="preserve">Tell: </w:t>
-      </w:r>
-      <w:r>
-        <w:t xml:space="preserve">{{KIRAYSTE_WAKIIL_TELEFOON}}</w:t>
-      </w:r>
-    </w:p>
-    <w:p>
-      <w:pPr>
-        <w:spacing w:after="80"/>
-      </w:pPr>
-      <w:r>
-        <w:rPr>
-          <w:b/>
-          <w:bCs/>
-        </w:rPr>
-        <w:t xml:space="preserve">{{END:KIRAYSTE_WAKIIL}}</w:t>
       </w:r>
     </w:p>
     <w:sectPr>

</xml_diff>

<commit_message>
Freebuff: FINAL CORRECTION — REPRESENTATIVE GROUPING UI + DOCUMENT...
</commit_message>
<xml_diff>
--- a/public/templates/heshiis_kiro_template_v2.docx
+++ b/public/templates/heshiis_kiro_template_v2.docx
@@ -128,7 +128,28 @@
         <w:spacing w:after="60"/>
       </w:pPr>
       <w:r>
-        <w:t xml:space="preserve">❖ Wakiilka: {{KIREEYE_WAKIIL_MAGAC}}</w:t>
+        <w:t xml:space="preserve">❖ {{KIREYE_MAGAC}}</w:t>
+      </w:r>
+      <w:r>
+        <w:tab/>
+      </w:r>
+      <w:r>
+        <w:t xml:space="preserve">Tell {{KIREYE_TELEFOON}}</w:t>
+      </w:r>
+    </w:p>
+    <w:p>
+      <w:pPr>
+        <w:spacing w:after="60"/>
+      </w:pPr>
+      <w:r>
+        <w:t xml:space="preserve">    Wakiilka: </w:t>
+      </w:r>
+      <w:r>
+        <w:rPr>
+          <w:b/>
+          <w:bCs/>
+        </w:rPr>
+        <w:t xml:space="preserve">{{KIREEYE_WAKIIL_MAGAC}}</w:t>
       </w:r>
       <w:r>
         <w:tab/>
@@ -259,7 +280,28 @@
         <w:spacing w:after="60"/>
       </w:pPr>
       <w:r>
-        <w:t xml:space="preserve">❖ {{NUMBER}}. Wakiilka: {{WAKIIL_MAGAC}}</w:t>
+        <w:t xml:space="preserve">❖ {{NUMBER}}. {{MAGAC}}</w:t>
+      </w:r>
+      <w:r>
+        <w:tab/>
+      </w:r>
+      <w:r>
+        <w:t xml:space="preserve">Tell </w:t>
+      </w:r>
+    </w:p>
+    <w:p>
+      <w:pPr>
+        <w:spacing w:after="60"/>
+      </w:pPr>
+      <w:r>
+        <w:t xml:space="preserve">    Wakiilka: </w:t>
+      </w:r>
+      <w:r>
+        <w:rPr>
+          <w:b/>
+          <w:bCs/>
+        </w:rPr>
+        <w:t xml:space="preserve">{{WAKIIL_MAGAC}}</w:t>
       </w:r>
       <w:r>
         <w:tab/>
@@ -390,7 +432,28 @@
         <w:spacing w:after="60"/>
       </w:pPr>
       <w:r>
-        <w:t xml:space="preserve">❖ Wakiilka: {{KIRAYSTE_WAKIIL_MAGAC}}</w:t>
+        <w:t xml:space="preserve">❖ {{KIRAYSTE_MAGAC}}</w:t>
+      </w:r>
+      <w:r>
+        <w:tab/>
+      </w:r>
+      <w:r>
+        <w:t xml:space="preserve">Tell {{KIRAYSTE_TELEFOON}}</w:t>
+      </w:r>
+    </w:p>
+    <w:p>
+      <w:pPr>
+        <w:spacing w:after="60"/>
+      </w:pPr>
+      <w:r>
+        <w:t xml:space="preserve">    Wakiilka: </w:t>
+      </w:r>
+      <w:r>
+        <w:rPr>
+          <w:b/>
+          <w:bCs/>
+        </w:rPr>
+        <w:t xml:space="preserve">{{KIRAYSTE_WAKIIL_MAGAC}}</w:t>
       </w:r>
       <w:r>
         <w:tab/>
@@ -521,7 +584,28 @@
         <w:spacing w:after="60"/>
       </w:pPr>
       <w:r>
-        <w:t xml:space="preserve">❖ {{NUMBER}}. Wakiilka: {{WAKIIL_MAGAC}}</w:t>
+        <w:t xml:space="preserve">❖ {{NUMBER}}. {{MAGAC}}</w:t>
+      </w:r>
+      <w:r>
+        <w:tab/>
+      </w:r>
+      <w:r>
+        <w:t xml:space="preserve">Tell </w:t>
+      </w:r>
+    </w:p>
+    <w:p>
+      <w:pPr>
+        <w:spacing w:after="60"/>
+      </w:pPr>
+      <w:r>
+        <w:t xml:space="preserve">    Wakiilka: </w:t>
+      </w:r>
+      <w:r>
+        <w:rPr>
+          <w:b/>
+          <w:bCs/>
+        </w:rPr>
+        <w:t xml:space="preserve">{{WAKIIL_MAGAC}}</w:t>
       </w:r>
       <w:r>
         <w:tab/>

</xml_diff>

<commit_message>
Freebuff: Waxaan arkay correction-ka, waana sax waxa aad samaysay
</commit_message>
<xml_diff>
--- a/public/templates/heshiis_kiro_template_v2.docx
+++ b/public/templates/heshiis_kiro_template_v2.docx
@@ -282,12 +282,6 @@
       <w:r>
         <w:t xml:space="preserve">❖ {{NUMBER}}. {{MAGAC}}</w:t>
       </w:r>
-      <w:r>
-        <w:tab/>
-      </w:r>
-      <w:r>
-        <w:t xml:space="preserve">Tell </w:t>
-      </w:r>
     </w:p>
     <w:p>
       <w:pPr>
@@ -585,12 +579,6 @@
       </w:pPr>
       <w:r>
         <w:t xml:space="preserve">❖ {{NUMBER}}. {{MAGAC}}</w:t>
-      </w:r>
-      <w:r>
-        <w:tab/>
-      </w:r>
-      <w:r>
-        <w:t xml:space="preserve">Tell </w:t>
       </w:r>
     </w:p>
     <w:p>

</xml_diff>

<commit_message>
Freebuff: FINAL TEMPLATE STRUCTURE CORRECTION — REMOVE ALL SIGNATUR...
</commit_message>
<xml_diff>
--- a/public/templates/heshiis_kiro_template_v2.docx
+++ b/public/templates/heshiis_kiro_template_v2.docx
@@ -936,15 +936,20 @@
     </w:p>
     <w:p>
       <w:pPr>
-        <w:spacing w:after="120" w:before="240"/>
-        <w:jc w:val="left"/>
-      </w:pPr>
-      <w:r>
-        <w:rPr>
-          <w:b/>
-          <w:bCs/>
-        </w:rPr>
-        <w:t xml:space="preserve">Cadaynta Xafiiska: Xafiisku waxa uu cadaynayaa in heshiiskani-kirada ahi u dhacay sifo sharciga waafaqsan, waafqaan laguna hor saxeexay laguna camal-fali doono.</w:t>
+        <w:spacing w:after="120" w:line="300"/>
+        <w:jc w:val="both"/>
+      </w:pPr>
+      <w:r>
+        <w:t xml:space="preserve">Cadaynta Xafiiska:</w:t>
+      </w:r>
+    </w:p>
+    <w:p>
+      <w:pPr>
+        <w:spacing w:after="120" w:line="300"/>
+        <w:jc w:val="both"/>
+      </w:pPr>
+      <w:r>
+        <w:t xml:space="preserve">Xafiisku waxa uu cadaynayaa in heshiiskani-kirada ahi u dhacay sifo sharciga waafaqsan, waafaqaan laguna hor saxeexay laguna camal-fali doono.</w:t>
       </w:r>
     </w:p>
     <w:p>
@@ -959,750 +964,6 @@
           <w:u w:val="single"/>
         </w:rPr>
         <w:t xml:space="preserve">(Sarkaalka Xafiiska Nootaayada Sharciga ah Ee Daloodho)</w:t>
-      </w:r>
-    </w:p>
-    <w:p>
-      <w:pPr>
-        <w:spacing w:after="80" w:before="320"/>
-      </w:pPr>
-      <w:r>
-        <w:rPr>
-          <w:b/>
-          <w:bCs/>
-        </w:rPr>
-        <w:t xml:space="preserve">Saxiiyada:</w:t>
-      </w:r>
-    </w:p>
-    <w:p>
-      <w:pPr>
-        <w:spacing w:after="80"/>
-      </w:pPr>
-      <w:r>
-        <w:rPr>
-          <w:b/>
-          <w:bCs/>
-        </w:rPr>
-        <w:t xml:space="preserve">{{IF:KIREYE_HAL}}</w:t>
-      </w:r>
-    </w:p>
-    <w:p>
-      <w:pPr>
-        <w:spacing w:after="80"/>
-      </w:pPr>
-      <w:r>
-        <w:rPr>
-          <w:b/>
-          <w:bCs/>
-        </w:rPr>
-        <w:t xml:space="preserve">{{IF:KIREEYE_JOOGA}}</w:t>
-      </w:r>
-    </w:p>
-    <w:p>
-      <w:pPr>
-        <w:spacing w:after="60" w:before="240"/>
-      </w:pPr>
-      <w:r>
-        <w:rPr>
-          <w:b/>
-          <w:bCs/>
-        </w:rPr>
-        <w:t xml:space="preserve">Kireeye</w:t>
-      </w:r>
-    </w:p>
-    <w:p>
-      <w:pPr>
-        <w:spacing w:after="60"/>
-      </w:pPr>
-      <w:r>
-        <w:t xml:space="preserve">Saxiix: ____________________</w:t>
-      </w:r>
-    </w:p>
-    <w:p>
-      <w:r>
-        <w:t xml:space="preserve">Magac: </w:t>
-      </w:r>
-      <w:r>
-        <w:t xml:space="preserve">{{KIREYE_MAGAC}}</w:t>
-      </w:r>
-    </w:p>
-    <w:p>
-      <w:r>
-        <w:t xml:space="preserve">Tell: </w:t>
-      </w:r>
-      <w:r>
-        <w:t xml:space="preserve">{{KIREYE_TELEFOON}}</w:t>
-      </w:r>
-    </w:p>
-    <w:p>
-      <w:pPr>
-        <w:spacing w:after="80"/>
-      </w:pPr>
-      <w:r>
-        <w:rPr>
-          <w:b/>
-          <w:bCs/>
-        </w:rPr>
-        <w:t xml:space="preserve">{{END:KIREEYE_JOOGA}}</w:t>
-      </w:r>
-    </w:p>
-    <w:p>
-      <w:pPr>
-        <w:spacing w:after="80"/>
-      </w:pPr>
-      <w:r>
-        <w:rPr>
-          <w:b/>
-          <w:bCs/>
-        </w:rPr>
-        <w:t xml:space="preserve">{{IF:KIREEYE_WAKIIL}}</w:t>
-      </w:r>
-    </w:p>
-    <w:p>
-      <w:pPr>
-        <w:spacing w:after="60" w:before="240"/>
-      </w:pPr>
-      <w:r>
-        <w:rPr>
-          <w:b/>
-          <w:bCs/>
-        </w:rPr>
-        <w:t xml:space="preserve">Wakiilka (oo matalaya Kireeyaha)</w:t>
-      </w:r>
-    </w:p>
-    <w:p>
-      <w:pPr>
-        <w:spacing w:after="60"/>
-      </w:pPr>
-      <w:r>
-        <w:t xml:space="preserve">Saxiix: ____________________</w:t>
-      </w:r>
-    </w:p>
-    <w:p>
-      <w:r>
-        <w:t xml:space="preserve">Magac: </w:t>
-      </w:r>
-      <w:r>
-        <w:t xml:space="preserve">{{KIREEYE_WAKIIL_MAGAC}}</w:t>
-      </w:r>
-    </w:p>
-    <w:p>
-      <w:r>
-        <w:t xml:space="preserve">Tell: </w:t>
-      </w:r>
-      <w:r>
-        <w:t xml:space="preserve">{{KIREEYE_WAKIIL_TELEFOON}}</w:t>
-      </w:r>
-    </w:p>
-    <w:p>
-      <w:pPr>
-        <w:spacing w:after="80"/>
-      </w:pPr>
-      <w:r>
-        <w:rPr>
-          <w:b/>
-          <w:bCs/>
-        </w:rPr>
-        <w:t xml:space="preserve">{{END:KIREEYE_WAKIIL}}</w:t>
-      </w:r>
-    </w:p>
-    <w:p>
-      <w:pPr>
-        <w:spacing w:after="80"/>
-      </w:pPr>
-      <w:r>
-        <w:rPr>
-          <w:b/>
-          <w:bCs/>
-        </w:rPr>
-        <w:t xml:space="preserve">{{END:KIREYE_HAL}}</w:t>
-      </w:r>
-    </w:p>
-    <w:p>
-      <w:pPr>
-        <w:spacing w:after="80"/>
-      </w:pPr>
-      <w:r>
-        <w:rPr>
-          <w:b/>
-          <w:bCs/>
-        </w:rPr>
-        <w:t xml:space="preserve">{{IF:KIREEYAYAAL_BADAN}}</w:t>
-      </w:r>
-    </w:p>
-    <w:p>
-      <w:pPr>
-        <w:spacing w:after="80"/>
-      </w:pPr>
-      <w:r>
-        <w:rPr>
-          <w:b/>
-          <w:bCs/>
-        </w:rPr>
-        <w:t xml:space="preserve">{{#KIREYEYAYAAL}}</w:t>
-      </w:r>
-    </w:p>
-    <w:p>
-      <w:pPr>
-        <w:spacing w:after="80"/>
-      </w:pPr>
-      <w:r>
-        <w:rPr>
-          <w:b/>
-          <w:bCs/>
-        </w:rPr>
-        <w:t xml:space="preserve">{{IF:JOOGA}}</w:t>
-      </w:r>
-    </w:p>
-    <w:p>
-      <w:pPr>
-        <w:spacing w:after="60" w:before="240"/>
-      </w:pPr>
-      <w:r>
-        <w:rPr>
-          <w:b/>
-          <w:bCs/>
-        </w:rPr>
-        <w:t xml:space="preserve">Kireeye {{NUMBER}}</w:t>
-      </w:r>
-    </w:p>
-    <w:p>
-      <w:pPr>
-        <w:spacing w:after="60"/>
-      </w:pPr>
-      <w:r>
-        <w:t xml:space="preserve">Saxiix: ____________________</w:t>
-      </w:r>
-    </w:p>
-    <w:p>
-      <w:r>
-        <w:t xml:space="preserve">Magac: </w:t>
-      </w:r>
-      <w:r>
-        <w:t xml:space="preserve">{{MAGAC}}</w:t>
-      </w:r>
-    </w:p>
-    <w:p>
-      <w:r>
-        <w:t xml:space="preserve">Tell: </w:t>
-      </w:r>
-      <w:r>
-        <w:t xml:space="preserve">{{TELEFOON}}</w:t>
-      </w:r>
-    </w:p>
-    <w:p>
-      <w:pPr>
-        <w:spacing w:after="80"/>
-      </w:pPr>
-      <w:r>
-        <w:rPr>
-          <w:b/>
-          <w:bCs/>
-        </w:rPr>
-        <w:t xml:space="preserve">{{END:JOOGA}}</w:t>
-      </w:r>
-    </w:p>
-    <w:p>
-      <w:pPr>
-        <w:spacing w:after="80"/>
-      </w:pPr>
-      <w:r>
-        <w:rPr>
-          <w:b/>
-          <w:bCs/>
-        </w:rPr>
-        <w:t xml:space="preserve">{{/KIREYEYAYAAL}}</w:t>
-      </w:r>
-    </w:p>
-    <w:p>
-      <w:pPr>
-        <w:spacing w:after="80"/>
-      </w:pPr>
-      <w:r>
-        <w:rPr>
-          <w:b/>
-          <w:bCs/>
-        </w:rPr>
-        <w:t xml:space="preserve">{{END:KIREEYAYAAL_BADAN}}</w:t>
-      </w:r>
-    </w:p>
-    <w:p>
-      <w:pPr>
-        <w:spacing w:after="80"/>
-      </w:pPr>
-      <w:r>
-        <w:rPr>
-          <w:b/>
-          <w:bCs/>
-        </w:rPr>
-        <w:t xml:space="preserve">{{IF:KIRAYSTE_HAL}}</w:t>
-      </w:r>
-    </w:p>
-    <w:p>
-      <w:pPr>
-        <w:spacing w:after="80"/>
-      </w:pPr>
-      <w:r>
-        <w:rPr>
-          <w:b/>
-          <w:bCs/>
-        </w:rPr>
-        <w:t xml:space="preserve">{{IF:KIRAYSTE_JOOGA}}</w:t>
-      </w:r>
-    </w:p>
-    <w:p>
-      <w:pPr>
-        <w:spacing w:after="60" w:before="240"/>
-      </w:pPr>
-      <w:r>
-        <w:rPr>
-          <w:b/>
-          <w:bCs/>
-        </w:rPr>
-        <w:t xml:space="preserve">Kirayste</w:t>
-      </w:r>
-    </w:p>
-    <w:p>
-      <w:pPr>
-        <w:spacing w:after="60"/>
-      </w:pPr>
-      <w:r>
-        <w:t xml:space="preserve">Saxiix: ____________________</w:t>
-      </w:r>
-    </w:p>
-    <w:p>
-      <w:r>
-        <w:t xml:space="preserve">Magac: </w:t>
-      </w:r>
-      <w:r>
-        <w:t xml:space="preserve">{{KIRAYSTE_MAGAC}}</w:t>
-      </w:r>
-    </w:p>
-    <w:p>
-      <w:r>
-        <w:t xml:space="preserve">Tell: </w:t>
-      </w:r>
-      <w:r>
-        <w:t xml:space="preserve">{{KIRAYSTE_TELEFOON}}</w:t>
-      </w:r>
-    </w:p>
-    <w:p>
-      <w:pPr>
-        <w:spacing w:after="80"/>
-      </w:pPr>
-      <w:r>
-        <w:rPr>
-          <w:b/>
-          <w:bCs/>
-        </w:rPr>
-        <w:t xml:space="preserve">{{END:KIRAYSTE_JOOGA}}</w:t>
-      </w:r>
-    </w:p>
-    <w:p>
-      <w:pPr>
-        <w:spacing w:after="80"/>
-      </w:pPr>
-      <w:r>
-        <w:rPr>
-          <w:b/>
-          <w:bCs/>
-        </w:rPr>
-        <w:t xml:space="preserve">{{IF:KIRAYSTE_WAKIIL}}</w:t>
-      </w:r>
-    </w:p>
-    <w:p>
-      <w:pPr>
-        <w:spacing w:after="60" w:before="240"/>
-      </w:pPr>
-      <w:r>
-        <w:rPr>
-          <w:b/>
-          <w:bCs/>
-        </w:rPr>
-        <w:t xml:space="preserve">Wakiilka (oo matalaya Kiraystaha)</w:t>
-      </w:r>
-    </w:p>
-    <w:p>
-      <w:pPr>
-        <w:spacing w:after="60"/>
-      </w:pPr>
-      <w:r>
-        <w:t xml:space="preserve">Saxiix: ____________________</w:t>
-      </w:r>
-    </w:p>
-    <w:p>
-      <w:r>
-        <w:t xml:space="preserve">Magac: </w:t>
-      </w:r>
-      <w:r>
-        <w:t xml:space="preserve">{{KIRAYSTE_WAKIIL_MAGAC}}</w:t>
-      </w:r>
-    </w:p>
-    <w:p>
-      <w:r>
-        <w:t xml:space="preserve">Tell: </w:t>
-      </w:r>
-      <w:r>
-        <w:t xml:space="preserve">{{KIRAYSTE_WAKIIL_TELEFOON}}</w:t>
-      </w:r>
-    </w:p>
-    <w:p>
-      <w:pPr>
-        <w:spacing w:after="80"/>
-      </w:pPr>
-      <w:r>
-        <w:rPr>
-          <w:b/>
-          <w:bCs/>
-        </w:rPr>
-        <w:t xml:space="preserve">{{END:KIRAYSTE_WAKIIL}}</w:t>
-      </w:r>
-    </w:p>
-    <w:p>
-      <w:pPr>
-        <w:spacing w:after="80"/>
-      </w:pPr>
-      <w:r>
-        <w:rPr>
-          <w:b/>
-          <w:bCs/>
-        </w:rPr>
-        <w:t xml:space="preserve">{{END:KIRAYSTE_HAL}}</w:t>
-      </w:r>
-    </w:p>
-    <w:p>
-      <w:pPr>
-        <w:spacing w:after="80"/>
-      </w:pPr>
-      <w:r>
-        <w:rPr>
-          <w:b/>
-          <w:bCs/>
-        </w:rPr>
-        <w:t xml:space="preserve">{{IF:KIRAYSTAYAAL_BADAN}}</w:t>
-      </w:r>
-    </w:p>
-    <w:p>
-      <w:pPr>
-        <w:spacing w:after="80"/>
-      </w:pPr>
-      <w:r>
-        <w:rPr>
-          <w:b/>
-          <w:bCs/>
-        </w:rPr>
-        <w:t xml:space="preserve">{{#KIRAYSTAYAAL}}</w:t>
-      </w:r>
-    </w:p>
-    <w:p>
-      <w:pPr>
-        <w:spacing w:after="80"/>
-      </w:pPr>
-      <w:r>
-        <w:rPr>
-          <w:b/>
-          <w:bCs/>
-        </w:rPr>
-        <w:t xml:space="preserve">{{IF:JOOGA}}</w:t>
-      </w:r>
-    </w:p>
-    <w:p>
-      <w:pPr>
-        <w:spacing w:after="60" w:before="240"/>
-      </w:pPr>
-      <w:r>
-        <w:rPr>
-          <w:b/>
-          <w:bCs/>
-        </w:rPr>
-        <w:t xml:space="preserve">Kirayste {{NUMBER}}</w:t>
-      </w:r>
-    </w:p>
-    <w:p>
-      <w:pPr>
-        <w:spacing w:after="60"/>
-      </w:pPr>
-      <w:r>
-        <w:t xml:space="preserve">Saxiix: ____________________</w:t>
-      </w:r>
-    </w:p>
-    <w:p>
-      <w:r>
-        <w:t xml:space="preserve">Magac: </w:t>
-      </w:r>
-      <w:r>
-        <w:t xml:space="preserve">{{MAGAC}}</w:t>
-      </w:r>
-    </w:p>
-    <w:p>
-      <w:r>
-        <w:t xml:space="preserve">Tell: </w:t>
-      </w:r>
-      <w:r>
-        <w:t xml:space="preserve">{{TELEFOON}}</w:t>
-      </w:r>
-    </w:p>
-    <w:p>
-      <w:pPr>
-        <w:spacing w:after="80"/>
-      </w:pPr>
-      <w:r>
-        <w:rPr>
-          <w:b/>
-          <w:bCs/>
-        </w:rPr>
-        <w:t xml:space="preserve">{{END:JOOGA}}</w:t>
-      </w:r>
-    </w:p>
-    <w:p>
-      <w:pPr>
-        <w:spacing w:after="80"/>
-      </w:pPr>
-      <w:r>
-        <w:rPr>
-          <w:b/>
-          <w:bCs/>
-        </w:rPr>
-        <w:t xml:space="preserve">{{/KIRAYSTAYAAL}}</w:t>
-      </w:r>
-    </w:p>
-    <w:p>
-      <w:pPr>
-        <w:spacing w:after="80"/>
-      </w:pPr>
-      <w:r>
-        <w:rPr>
-          <w:b/>
-          <w:bCs/>
-        </w:rPr>
-        <w:t xml:space="preserve">{{END:KIRAYSTAYAAL_BADAN}}</w:t>
-      </w:r>
-    </w:p>
-    <w:p>
-      <w:pPr>
-        <w:spacing w:after="80"/>
-      </w:pPr>
-      <w:r>
-        <w:rPr>
-          <w:b/>
-          <w:bCs/>
-        </w:rPr>
-        <w:t xml:space="preserve">{{IF:KIREEYAYAAL_BADAN}}</w:t>
-      </w:r>
-    </w:p>
-    <w:p>
-      <w:pPr>
-        <w:spacing w:after="80"/>
-      </w:pPr>
-      <w:r>
-        <w:rPr>
-          <w:b/>
-          <w:bCs/>
-        </w:rPr>
-        <w:t xml:space="preserve">{{IF:KIREEYE_WAKIIL}}</w:t>
-      </w:r>
-    </w:p>
-    <w:p>
-      <w:pPr>
-        <w:spacing w:after="60" w:before="240"/>
-      </w:pPr>
-      <w:r>
-        <w:rPr>
-          <w:b/>
-          <w:bCs/>
-        </w:rPr>
-        <w:t xml:space="preserve">Wakiilka (oo matalaya Kireeyada)</w:t>
-      </w:r>
-    </w:p>
-    <w:p>
-      <w:pPr>
-        <w:spacing w:after="60"/>
-      </w:pPr>
-      <w:r>
-        <w:t xml:space="preserve">Saxiix: ____________________</w:t>
-      </w:r>
-    </w:p>
-    <w:p>
-      <w:r>
-        <w:t xml:space="preserve">Magac: </w:t>
-      </w:r>
-      <w:r>
-        <w:t xml:space="preserve">{{KIREEYE_WAKIIL_MAGAC}}</w:t>
-      </w:r>
-    </w:p>
-    <w:p>
-      <w:r>
-        <w:t xml:space="preserve">Tell: </w:t>
-      </w:r>
-      <w:r>
-        <w:t xml:space="preserve">{{KIREEYE_WAKIIL_TELEFOON}}</w:t>
-      </w:r>
-    </w:p>
-    <w:p>
-      <w:pPr>
-        <w:spacing w:after="80"/>
-      </w:pPr>
-      <w:r>
-        <w:rPr>
-          <w:b/>
-          <w:bCs/>
-        </w:rPr>
-        <w:t xml:space="preserve">{{END:KIREEYE_WAKIIL}}</w:t>
-      </w:r>
-    </w:p>
-    <w:p>
-      <w:pPr>
-        <w:spacing w:after="80"/>
-      </w:pPr>
-      <w:r>
-        <w:rPr>
-          <w:b/>
-          <w:bCs/>
-        </w:rPr>
-        <w:t xml:space="preserve">{{END:KIREEYAYAAL_BADAN}}</w:t>
-      </w:r>
-    </w:p>
-    <w:p>
-      <w:pPr>
-        <w:spacing w:after="80"/>
-      </w:pPr>
-      <w:r>
-        <w:rPr>
-          <w:b/>
-          <w:bCs/>
-        </w:rPr>
-        <w:t xml:space="preserve">{{IF:KIRAYSTAYAAL_BADAN}}</w:t>
-      </w:r>
-    </w:p>
-    <w:p>
-      <w:pPr>
-        <w:spacing w:after="80"/>
-      </w:pPr>
-      <w:r>
-        <w:rPr>
-          <w:b/>
-          <w:bCs/>
-        </w:rPr>
-        <w:t xml:space="preserve">{{IF:KIRAYSTE_WAKIIL}}</w:t>
-      </w:r>
-    </w:p>
-    <w:p>
-      <w:pPr>
-        <w:spacing w:after="60" w:before="240"/>
-      </w:pPr>
-      <w:r>
-        <w:rPr>
-          <w:b/>
-          <w:bCs/>
-        </w:rPr>
-        <w:t xml:space="preserve">Wakiilka (oo matalaya Kiraystada)</w:t>
-      </w:r>
-    </w:p>
-    <w:p>
-      <w:pPr>
-        <w:spacing w:after="60"/>
-      </w:pPr>
-      <w:r>
-        <w:t xml:space="preserve">Saxiix: ____________________</w:t>
-      </w:r>
-    </w:p>
-    <w:p>
-      <w:r>
-        <w:t xml:space="preserve">Magac: </w:t>
-      </w:r>
-      <w:r>
-        <w:t xml:space="preserve">{{KIRAYSTE_WAKIIL_MAGAC}}</w:t>
-      </w:r>
-    </w:p>
-    <w:p>
-      <w:r>
-        <w:t xml:space="preserve">Tell: </w:t>
-      </w:r>
-      <w:r>
-        <w:t xml:space="preserve">{{KIRAYSTE_WAKIIL_TELEFOON}}</w:t>
-      </w:r>
-    </w:p>
-    <w:p>
-      <w:pPr>
-        <w:spacing w:after="80"/>
-      </w:pPr>
-      <w:r>
-        <w:rPr>
-          <w:b/>
-          <w:bCs/>
-        </w:rPr>
-        <w:t xml:space="preserve">{{END:KIRAYSTE_WAKIIL}}</w:t>
-      </w:r>
-    </w:p>
-    <w:p>
-      <w:pPr>
-        <w:spacing w:after="80"/>
-      </w:pPr>
-      <w:r>
-        <w:rPr>
-          <w:b/>
-          <w:bCs/>
-        </w:rPr>
-        <w:t xml:space="preserve">{{END:KIRAYSTAYAAL_BADAN}}</w:t>
-      </w:r>
-    </w:p>
-    <w:p>
-      <w:pPr>
-        <w:spacing w:after="80"/>
-      </w:pPr>
-      <w:r>
-        <w:rPr>
-          <w:b/>
-          <w:bCs/>
-        </w:rPr>
-        <w:t xml:space="preserve">{{IF:DAMIIN_HAA}}</w:t>
-      </w:r>
-    </w:p>
-    <w:p>
-      <w:pPr>
-        <w:spacing w:after="60" w:before="240"/>
-      </w:pPr>
-      <w:r>
-        <w:rPr>
-          <w:b/>
-          <w:bCs/>
-        </w:rPr>
-        <w:t xml:space="preserve">Damiin</w:t>
-      </w:r>
-    </w:p>
-    <w:p>
-      <w:pPr>
-        <w:spacing w:after="60"/>
-      </w:pPr>
-      <w:r>
-        <w:t xml:space="preserve">Saxiix: ____________________</w:t>
-      </w:r>
-    </w:p>
-    <w:p>
-      <w:r>
-        <w:t xml:space="preserve">Magac: </w:t>
-      </w:r>
-      <w:r>
-        <w:t xml:space="preserve">{{DAMIIN_MAGAC}}</w:t>
-      </w:r>
-    </w:p>
-    <w:p>
-      <w:r>
-        <w:t xml:space="preserve">Tell: </w:t>
-      </w:r>
-      <w:r>
-        <w:t xml:space="preserve">{{DAMIIN_TELEFOON}}</w:t>
-      </w:r>
-    </w:p>
-    <w:p>
-      <w:pPr>
-        <w:spacing w:after="80"/>
-      </w:pPr>
-      <w:r>
-        <w:rPr>
-          <w:b/>
-          <w:bCs/>
-        </w:rPr>
-        <w:t xml:space="preserve">{{END:DAMIIN_HAA}}</w:t>
       </w:r>
     </w:p>
     <w:sectPr>

</xml_diff>

<commit_message>
Freebuff: Ha bilaabin correction-ka adigoo hal mismatch oo keliya h...
</commit_message>
<xml_diff>
--- a/public/templates/heshiis_kiro_template_v2.docx
+++ b/public/templates/heshiis_kiro_template_v2.docx
@@ -39,7 +39,7 @@
           <w:szCs w:val="32"/>
           <w:u w:val="single"/>
         </w:rPr>
-        <w:t xml:space="preserve">HESHIIS KIRO GURI XAAS.</w:t>
+        <w:t xml:space="preserve">HESHIIS KIRO {{NOOCA_KIRADA}}.</w:t>
       </w:r>
     </w:p>
     <w:p>
@@ -644,7 +644,7 @@
         <w:jc w:val="both"/>
       </w:pPr>
       <w:r>
-        <w:t xml:space="preserve">Waa Guri Xaas ku yaalla {{GURI_GOOBTA}}, {{GURI_SHARRAXAAD}}</w:t>
+        <w:t xml:space="preserve">Waa {{GURI_NOOCA}} ku yaalla {{GURI_GOOBTA}}, {{GURI_SHARRAXAAD}}</w:t>
       </w:r>
     </w:p>
     <w:p>
@@ -669,34 +669,34 @@
         <w:jc w:val="both"/>
       </w:pPr>
       <w:r>
-        <w:t xml:space="preserve">1. Qiimaha Bishii Gurigu waa {{KIRADA_QIIMAHA}} {{KIRADA_QIIMAHA_QORAAL}}.</w:t>
-      </w:r>
-    </w:p>
-    <w:p>
-      <w:pPr>
-        <w:spacing w:after="120" w:line="300"/>
-        <w:jc w:val="both"/>
-      </w:pPr>
-      <w:r>
-        <w:t xml:space="preserve">2. Taariikhda kiradu ka bilaabantay waa {{TAARIIKH_BILOWGA}}.</w:t>
-      </w:r>
-    </w:p>
-    <w:p>
-      <w:pPr>
-        <w:spacing w:after="120" w:line="300"/>
-        <w:jc w:val="both"/>
-      </w:pPr>
-      <w:r>
-        <w:t xml:space="preserve">3. Mudada Heshiiska Wejiga Koowaad waa {{XALADDA_KIRADA}}.</w:t>
-      </w:r>
-    </w:p>
-    <w:p>
-      <w:pPr>
-        <w:spacing w:after="120" w:line="300"/>
-        <w:jc w:val="both"/>
-      </w:pPr>
-      <w:r>
-        <w:t xml:space="preserve">4. Habka bixinta kiradu waa {{HABKA_BIXINTA}}.</w:t>
+        <w:t xml:space="preserve">{{CLAUSE_NO}}. Qiimaha Bishii Gurigu waa {{KIRADA_QIIMAHA}} {{KIRADA_QIIMAHA_QORAAL}}.</w:t>
+      </w:r>
+    </w:p>
+    <w:p>
+      <w:pPr>
+        <w:spacing w:after="120" w:line="300"/>
+        <w:jc w:val="both"/>
+      </w:pPr>
+      <w:r>
+        <w:t xml:space="preserve">{{CLAUSE_NO}}. Taariikhda kiradu ka bilaabantay waa {{TAARIIKH_BILOWGA}}.</w:t>
+      </w:r>
+    </w:p>
+    <w:p>
+      <w:pPr>
+        <w:spacing w:after="120" w:line="300"/>
+        <w:jc w:val="both"/>
+      </w:pPr>
+      <w:r>
+        <w:t xml:space="preserve">{{CLAUSE_NO}}. Mudada Heshiiska Wejiga Koowaad waa {{XALADDA_KIRADA}}.</w:t>
+      </w:r>
+    </w:p>
+    <w:p>
+      <w:pPr>
+        <w:spacing w:after="120" w:line="300"/>
+        <w:jc w:val="both"/>
+      </w:pPr>
+      <w:r>
+        <w:t xml:space="preserve">{{CLAUSE_NO}}. Habka bixinta kiradu waa {{HABKA_BIXINTA}}.</w:t>
       </w:r>
     </w:p>
     <w:p>
@@ -738,7 +738,7 @@
         <w:jc w:val="both"/>
       </w:pPr>
       <w:r>
-        <w:t xml:space="preserve">5. Bil walbana Lacagta kirada waxaa uu qadimayaa bisha {{TAARIIKH_BILOWGA}}, lacagta kirada waxaa la qadimay {{KIRADA_QIIMAHA}} {{KIRADA_QIIMAHA_QORAAL}}. {{FAAHFAAHIN_LACAGTA}}</w:t>
+        <w:t xml:space="preserve">{{CLAUSE_NO}}. Bil walbana Lacagta kirada waxaa uu qadimayaa bisha {{TAARIIKH_BILOWGA}}, lacagta kirada waxaa la qadimay {{KIRADA_QIIMAHA}} {{KIRADA_QIIMAHA_QORAAL}}. {{FAAHFAAHIN_LACAGTA}}</w:t>
       </w:r>
     </w:p>
     <w:p>
@@ -759,7 +759,7 @@
         <w:jc w:val="both"/>
       </w:pPr>
       <w:r>
-        <w:t xml:space="preserve">6. Haddii Kiraysadu Guriga u baahato, Waxay Kiraystaha siinaysaa 2 Bilood Ogaysiisa, {{DEEBAAJI_QIIMAHA}}. Waxaa shardi u ah in kiraystuhu fuliyo dhammaan qodobada heshiiska. Sidoo kale, haddii kiraystuhu iskii uga maarmo guriga, wuxuu ogeysiinta bixinayaa bil ka hor.</w:t>
+        <w:t xml:space="preserve">{{CLAUSE_NO}}. Haddii Kiraysadu Guriga u baahato, Waxay Kiraystaha siinaysaa 2 Bilood Ogaysiisa, {{DEEBAAJI_QIIMAHA}}. Waxaa shardi u ah in kiraystuhu fuliyo dhammaan qodobada heshiiska. Sidoo kale, haddii kiraystuhu iskii uga maarmo guriga, wuxuu ogeysiinta bixinayaa bil ka hor.</w:t>
       </w:r>
     </w:p>
     <w:p>
@@ -780,25 +780,25 @@
         <w:jc w:val="both"/>
       </w:pPr>
       <w:r>
-        <w:t xml:space="preserve">7. Kireystuhu Gurigan masii kireyn karo Qayb ahaan iyo gebi ahaan toona, waxaana ka reeban in lagu sameeyo Guriga Dhexdisa waxaabaha dintooda suuban, oo loo reebtay lamana dhigi karo Wax Hub ah, Walxo qarxa iyo Qalab Ciidan aan sharciyaysnayn, iyo inaanay jaarku kasoo cabanin.</w:t>
-      </w:r>
-    </w:p>
-    <w:p>
-      <w:pPr>
-        <w:spacing w:after="120" w:line="300"/>
-        <w:jc w:val="both"/>
-      </w:pPr>
-      <w:r>
-        <w:t xml:space="preserve">8. Haddii aan ahay Kireystaha guriga, wuxaan cadaynayaa in aan heshiiskan raali ka ahay, Masuulka ka ahay wixii khasaare soo gaadha mudada aan ku jiro Guriga, anigoo diyaar u ah in aan sameeyo sidistina ka dhigo marka laga reebo masibbooyinka dabiciiga ah biyaha iyo laydhka wixii aan isticmaalo. Aniga ayaa iska bixinay bill kasta, markaan ka baxayana waxaan balanqaadayaa inaan lacagta laydhka sii bixin doono.</w:t>
-      </w:r>
-    </w:p>
-    <w:p>
-      <w:pPr>
-        <w:spacing w:after="120" w:line="300"/>
-        <w:jc w:val="both"/>
-      </w:pPr>
-      <w:r>
-        <w:t xml:space="preserve">9. Heshiiskani Waxaa uu Dhaqan galaya isla Maanta, Dhina-cyada Midkoodna Kama Bixi karo iyada oo aan la dabaaqin qodobada Heshiiskan.</w:t>
+        <w:t xml:space="preserve">{{CLAUSE_NO}}. Kireystuhu Gurigan masii kireyn karo Qayb ahaan iyo gebi ahaan toona, waxaana ka reeban in lagu sameeyo Guriga Dhexdisa waxaabaha dintooda suuban, oo loo reebtay lamana dhigi karo Wax Hub ah, Walxo qarxa iyo Qalab Ciidan aan sharciyaysnayn, iyo inaanay jaarku kasoo cabanin.</w:t>
+      </w:r>
+    </w:p>
+    <w:p>
+      <w:pPr>
+        <w:spacing w:after="120" w:line="300"/>
+        <w:jc w:val="both"/>
+      </w:pPr>
+      <w:r>
+        <w:t xml:space="preserve">{{CLAUSE_NO}}. Haddii aan ahay Kireystaha guriga, wuxaan cadaynayaa in aan heshiiskan raali ka ahay, Masuulka ka ahay wixii khasaare soo gaadha mudada aan ku jiro Guriga, anigoo diyaar u ah in aan sameeyo sidistina ka dhigo marka laga reebo masibbooyinka dabiciiga ah biyaha iyo laydhka wixii aan isticmaalo. Aniga ayaa iska bixinay bill kasta, markaan ka baxayana waxaan balanqaadayaa inaan lacagta laydhka sii bixin doono.</w:t>
+      </w:r>
+    </w:p>
+    <w:p>
+      <w:pPr>
+        <w:spacing w:after="120" w:line="300"/>
+        <w:jc w:val="both"/>
+      </w:pPr>
+      <w:r>
+        <w:t xml:space="preserve">{{CLAUSE_NO}}. Heshiiskani Waxaa uu Dhaqan galaya isla Maanta, Dhina-cyada Midkoodna Kama Bixi karo iyada oo aan la dabaaqin qodobada Heshiiskan.</w:t>
       </w:r>
     </w:p>
     <w:p>
@@ -819,7 +819,7 @@
         <w:jc w:val="both"/>
       </w:pPr>
       <w:r>
-        <w:t xml:space="preserve">10. DAMIIN MAAL: Anigoo ah {{DAMIIN_MAGAC}}, Waxaan Cadaynayaa inaan Damiinta Buuxa ka ahay kiraystaha Gurigan. Haddii Dhinaca laga bilaabo wax Kaso noqdaan ama Lacag Lagu Yesho, Aniga ayaa la iiraacay doonaa.</w:t>
+        <w:t xml:space="preserve">{{CLAUSE_NO}}. DAMIIN MAAL: Anigoo ah {{DAMIIN_MAGAC}}, Waxaan Cadaynayaa inaan Damiinta Buuxa ka ahay kiraystaha Gurigan. Haddii Dhinaca laga bilaabo wax Kaso noqdaan ama Lacag Lagu Yesho, Aniga ayaa la iiraacay doonaa.</w:t>
       </w:r>
     </w:p>
     <w:p>
@@ -865,7 +865,7 @@
         <w:jc w:val="both"/>
       </w:pPr>
       <w:r>
-        <w:t xml:space="preserve">11. Sidana waxaanu ku saxeexnay xafiiska nootaayada sharciga ah hortisa, anagoo miyir iyo maan ba qabna, xiskayaguna dhan yahay.</w:t>
+        <w:t xml:space="preserve">{{CLAUSE_NO}}. Sidana waxaanu ku saxeexnay xafiiska nootaayada sharciga ah hortisa, anagoo miyir iyo maan ba qabna, xiskayaguna dhan yahay.</w:t>
       </w:r>
     </w:p>
     <w:p>
@@ -875,6 +875,460 @@
       </w:pPr>
       <w:r>
         <w:t xml:space="preserve">{{DHERAAD_SHURUUDO}}</w:t>
+      </w:r>
+    </w:p>
+    <w:p>
+      <w:pPr>
+        <w:spacing w:after="80"/>
+      </w:pPr>
+      <w:r>
+        <w:rPr>
+          <w:b/>
+          <w:bCs/>
+        </w:rPr>
+        <w:t xml:space="preserve">{{IF:ANNEX_HAS_VALUES}}</w:t>
+      </w:r>
+    </w:p>
+    <w:p>
+      <w:pPr>
+        <w:spacing w:after="140" w:before="200"/>
+        <w:jc w:val="center"/>
+      </w:pPr>
+      <w:r>
+        <w:rPr>
+          <w:b/>
+          <w:bCs/>
+          <w:sz w:val="24"/>
+          <w:szCs w:val="24"/>
+          <w:u w:val="single"/>
+        </w:rPr>
+        <w:t xml:space="preserve">XOGTA HESHIISKA</w:t>
+      </w:r>
+    </w:p>
+    <w:p>
+      <w:pPr>
+        <w:spacing w:after="80"/>
+      </w:pPr>
+      <w:r>
+        <w:rPr>
+          <w:b/>
+          <w:bCs/>
+        </w:rPr>
+        <w:t xml:space="preserve">{{IF:ANNEX_BANGIGA}}</w:t>
+      </w:r>
+    </w:p>
+    <w:p>
+      <w:pPr>
+        <w:spacing w:after="120" w:line="300"/>
+        <w:jc w:val="both"/>
+      </w:pPr>
+      <w:r>
+        <w:t xml:space="preserve">Magaca Bangiga: {{BANGIGA_MAGACA}}</w:t>
+      </w:r>
+    </w:p>
+    <w:p>
+      <w:pPr>
+        <w:spacing w:after="120" w:line="300"/>
+        <w:jc w:val="both"/>
+      </w:pPr>
+      <w:r>
+        <w:t xml:space="preserve">Nambarka Xisaabta: {{BANGIGA_HISAABKA}}</w:t>
+      </w:r>
+    </w:p>
+    <w:p>
+      <w:pPr>
+        <w:spacing w:after="80"/>
+      </w:pPr>
+      <w:r>
+        <w:rPr>
+          <w:b/>
+          <w:bCs/>
+        </w:rPr>
+        <w:t xml:space="preserve">{{END:ANNEX_BANGIGA}}</w:t>
+      </w:r>
+    </w:p>
+    <w:p>
+      <w:pPr>
+        <w:spacing w:after="80"/>
+      </w:pPr>
+      <w:r>
+        <w:rPr>
+          <w:b/>
+          <w:bCs/>
+        </w:rPr>
+        <w:t xml:space="preserve">{{IF:ANNEX_HADSHAN}}</w:t>
+      </w:r>
+    </w:p>
+    <w:p>
+      <w:pPr>
+        <w:spacing w:after="120" w:line="300"/>
+        <w:jc w:val="both"/>
+      </w:pPr>
+      <w:r>
+        <w:t xml:space="preserve">Lacagta Hadhsan: {{LACAGTA_HADSHAN}}</w:t>
+      </w:r>
+    </w:p>
+    <w:p>
+      <w:pPr>
+        <w:spacing w:after="80"/>
+      </w:pPr>
+      <w:r>
+        <w:rPr>
+          <w:b/>
+          <w:bCs/>
+        </w:rPr>
+        <w:t xml:space="preserve">{{END:ANNEX_HADSHAN}}</w:t>
+      </w:r>
+    </w:p>
+    <w:p>
+      <w:pPr>
+        <w:spacing w:after="80"/>
+      </w:pPr>
+      <w:r>
+        <w:rPr>
+          <w:b/>
+          <w:bCs/>
+        </w:rPr>
+        <w:t xml:space="preserve">{{IF:ANNEX_BIXINTA}}</w:t>
+      </w:r>
+    </w:p>
+    <w:p>
+      <w:pPr>
+        <w:spacing w:after="120" w:line="300"/>
+        <w:jc w:val="both"/>
+      </w:pPr>
+      <w:r>
+        <w:t xml:space="preserve">Maalinta Bixinta: {{MUDDADA_BIXINTA}}</w:t>
+      </w:r>
+    </w:p>
+    <w:p>
+      <w:pPr>
+        <w:spacing w:after="120" w:line="300"/>
+        <w:jc w:val="both"/>
+      </w:pPr>
+      <w:r>
+        <w:t xml:space="preserve">Xaaladda Bixinta: {{BIXINTA_HORE}}</w:t>
+      </w:r>
+    </w:p>
+    <w:p>
+      <w:pPr>
+        <w:spacing w:after="80"/>
+      </w:pPr>
+      <w:r>
+        <w:rPr>
+          <w:b/>
+          <w:bCs/>
+        </w:rPr>
+        <w:t xml:space="preserve">{{END:ANNEX_BIXINTA}}</w:t>
+      </w:r>
+    </w:p>
+    <w:p>
+      <w:pPr>
+        <w:spacing w:after="80"/>
+      </w:pPr>
+      <w:r>
+        <w:rPr>
+          <w:b/>
+          <w:bCs/>
+        </w:rPr>
+        <w:t xml:space="preserve">{{IF:ANNEX_CINWAAN}}</w:t>
+      </w:r>
+    </w:p>
+    <w:p>
+      <w:pPr>
+        <w:spacing w:after="120" w:line="300"/>
+        <w:jc w:val="both"/>
+      </w:pPr>
+      <w:r>
+        <w:t xml:space="preserve">Cinwaanka Guriga: {{GURI_CINWAAN}}</w:t>
+      </w:r>
+    </w:p>
+    <w:p>
+      <w:pPr>
+        <w:spacing w:after="80"/>
+      </w:pPr>
+      <w:r>
+        <w:rPr>
+          <w:b/>
+          <w:bCs/>
+        </w:rPr>
+        <w:t xml:space="preserve">{{END:ANNEX_CINWAAN}}</w:t>
+      </w:r>
+    </w:p>
+    <w:p>
+      <w:pPr>
+        <w:spacing w:after="80"/>
+      </w:pPr>
+      <w:r>
+        <w:rPr>
+          <w:b/>
+          <w:bCs/>
+        </w:rPr>
+        <w:t xml:space="preserve">{{IF:ANNEX_QOLADA}}</w:t>
+      </w:r>
+    </w:p>
+    <w:p>
+      <w:pPr>
+        <w:spacing w:after="120" w:line="300"/>
+        <w:jc w:val="both"/>
+      </w:pPr>
+      <w:r>
+        <w:t xml:space="preserve">Qolada: {{GURI_QOLADA}}</w:t>
+      </w:r>
+    </w:p>
+    <w:p>
+      <w:pPr>
+        <w:spacing w:after="80"/>
+      </w:pPr>
+      <w:r>
+        <w:rPr>
+          <w:b/>
+          <w:bCs/>
+        </w:rPr>
+        <w:t xml:space="preserve">{{END:ANNEX_QOLADA}}</w:t>
+      </w:r>
+    </w:p>
+    <w:p>
+      <w:pPr>
+        <w:spacing w:after="80"/>
+      </w:pPr>
+      <w:r>
+        <w:rPr>
+          <w:b/>
+          <w:bCs/>
+        </w:rPr>
+        <w:t xml:space="preserve">{{IF:ANNEX_SHURUUDAHA}}</w:t>
+      </w:r>
+    </w:p>
+    <w:p>
+      <w:pPr>
+        <w:spacing w:after="120" w:line="300"/>
+        <w:jc w:val="both"/>
+      </w:pPr>
+      <w:r>
+        <w:t xml:space="preserve">Shuruudaha Gaarka ah: {{SHURUUDAHA_GAARKA_AH}}</w:t>
+      </w:r>
+    </w:p>
+    <w:p>
+      <w:pPr>
+        <w:spacing w:after="80"/>
+      </w:pPr>
+      <w:r>
+        <w:rPr>
+          <w:b/>
+          <w:bCs/>
+        </w:rPr>
+        <w:t xml:space="preserve">{{END:ANNEX_SHURUUDAHA}}</w:t>
+      </w:r>
+    </w:p>
+    <w:p>
+      <w:pPr>
+        <w:spacing w:after="80"/>
+      </w:pPr>
+      <w:r>
+        <w:rPr>
+          <w:b/>
+          <w:bCs/>
+        </w:rPr>
+        <w:t xml:space="preserve">{{IF:ANNEX_DEEBAAJI}}</w:t>
+      </w:r>
+    </w:p>
+    <w:p>
+      <w:pPr>
+        <w:spacing w:after="120" w:line="300"/>
+        <w:jc w:val="both"/>
+      </w:pPr>
+      <w:r>
+        <w:t xml:space="preserve">Shuruudaha Deebaajiga: {{DEEBAAJI_SHURUUDO}}</w:t>
+      </w:r>
+    </w:p>
+    <w:p>
+      <w:pPr>
+        <w:spacing w:after="80"/>
+      </w:pPr>
+      <w:r>
+        <w:rPr>
+          <w:b/>
+          <w:bCs/>
+        </w:rPr>
+        <w:t xml:space="preserve">{{END:ANNEX_DEEBAAJI}}</w:t>
+      </w:r>
+    </w:p>
+    <w:p>
+      <w:pPr>
+        <w:spacing w:after="80"/>
+      </w:pPr>
+      <w:r>
+        <w:rPr>
+          <w:b/>
+          <w:bCs/>
+        </w:rPr>
+        <w:t xml:space="preserve">{{IF:ANNEX_DAMIIN_AQOONSI}}</w:t>
+      </w:r>
+    </w:p>
+    <w:p>
+      <w:pPr>
+        <w:spacing w:after="120" w:line="300"/>
+        <w:jc w:val="both"/>
+      </w:pPr>
+      <w:r>
+        <w:t xml:space="preserve">Aqoonsiga Damiinka: {{DAMIIN_AQOONSI}}</w:t>
+      </w:r>
+    </w:p>
+    <w:p>
+      <w:pPr>
+        <w:spacing w:after="80"/>
+      </w:pPr>
+      <w:r>
+        <w:rPr>
+          <w:b/>
+          <w:bCs/>
+        </w:rPr>
+        <w:t xml:space="preserve">{{END:ANNEX_DAMIIN_AQOONSI}}</w:t>
+      </w:r>
+    </w:p>
+    <w:p>
+      <w:pPr>
+        <w:spacing w:after="80"/>
+      </w:pPr>
+      <w:r>
+        <w:rPr>
+          <w:b/>
+          <w:bCs/>
+        </w:rPr>
+        <w:t xml:space="preserve">{{IF:ANNEX_DAMIIN_CINWAAN}}</w:t>
+      </w:r>
+    </w:p>
+    <w:p>
+      <w:pPr>
+        <w:spacing w:after="120" w:line="300"/>
+        <w:jc w:val="both"/>
+      </w:pPr>
+      <w:r>
+        <w:t xml:space="preserve">Cinwaanka Damiinka: {{DAMIIN_CINWAAN}}</w:t>
+      </w:r>
+    </w:p>
+    <w:p>
+      <w:pPr>
+        <w:spacing w:after="80"/>
+      </w:pPr>
+      <w:r>
+        <w:rPr>
+          <w:b/>
+          <w:bCs/>
+        </w:rPr>
+        <w:t xml:space="preserve">{{END:ANNEX_DAMIIN_CINWAAN}}</w:t>
+      </w:r>
+    </w:p>
+    <w:p>
+      <w:pPr>
+        <w:spacing w:after="80"/>
+      </w:pPr>
+      <w:r>
+        <w:rPr>
+          <w:b/>
+          <w:bCs/>
+        </w:rPr>
+        <w:t xml:space="preserve">{{IF:ANNEX_OGAYSIIN_MUDADA}}</w:t>
+      </w:r>
+    </w:p>
+    <w:p>
+      <w:pPr>
+        <w:spacing w:after="120" w:line="300"/>
+        <w:jc w:val="both"/>
+      </w:pPr>
+      <w:r>
+        <w:t xml:space="preserve">Mudada Ogaysiinta: {{OGAYSIIN_MUDADA}}</w:t>
+      </w:r>
+    </w:p>
+    <w:p>
+      <w:pPr>
+        <w:spacing w:after="80"/>
+      </w:pPr>
+      <w:r>
+        <w:rPr>
+          <w:b/>
+          <w:bCs/>
+        </w:rPr>
+        <w:t xml:space="preserve">{{END:ANNEX_OGAYSIIN_MUDADA}}</w:t>
+      </w:r>
+    </w:p>
+    <w:p>
+      <w:pPr>
+        <w:spacing w:after="80"/>
+      </w:pPr>
+      <w:r>
+        <w:rPr>
+          <w:b/>
+          <w:bCs/>
+        </w:rPr>
+        <w:t xml:space="preserve">{{IF:ANNEX_OGAYSIIN_SHURUUDO}}</w:t>
+      </w:r>
+    </w:p>
+    <w:p>
+      <w:pPr>
+        <w:spacing w:after="120" w:line="300"/>
+        <w:jc w:val="both"/>
+      </w:pPr>
+      <w:r>
+        <w:t xml:space="preserve">Shuruudaha Joojinta: {{OGAYSIIN_SHURUUDAH}}</w:t>
+      </w:r>
+    </w:p>
+    <w:p>
+      <w:pPr>
+        <w:spacing w:after="80"/>
+      </w:pPr>
+      <w:r>
+        <w:rPr>
+          <w:b/>
+          <w:bCs/>
+        </w:rPr>
+        <w:t xml:space="preserve">{{END:ANNEX_OGAYSIIN_SHURUUDO}}</w:t>
+      </w:r>
+    </w:p>
+    <w:p>
+      <w:pPr>
+        <w:spacing w:after="80"/>
+      </w:pPr>
+      <w:r>
+        <w:rPr>
+          <w:b/>
+          <w:bCs/>
+        </w:rPr>
+        <w:t xml:space="preserve">{{IF:ANNEX_OGAYSIIN_FAAHFAAHIN}}</w:t>
+      </w:r>
+    </w:p>
+    <w:p>
+      <w:pPr>
+        <w:spacing w:after="120" w:line="300"/>
+        <w:jc w:val="both"/>
+      </w:pPr>
+      <w:r>
+        <w:t xml:space="preserve">Faahfaahin Ogaysiin: {{OGAYSIIN_FAAHFAAHIN}}</w:t>
+      </w:r>
+    </w:p>
+    <w:p>
+      <w:pPr>
+        <w:spacing w:after="80"/>
+      </w:pPr>
+      <w:r>
+        <w:rPr>
+          <w:b/>
+          <w:bCs/>
+        </w:rPr>
+        <w:t xml:space="preserve">{{END:ANNEX_OGAYSIIN_FAAHFAAHIN}}</w:t>
+      </w:r>
+    </w:p>
+    <w:p>
+      <w:pPr>
+        <w:spacing w:after="80"/>
+      </w:pPr>
+      <w:r>
+        <w:rPr>
+          <w:b/>
+          <w:bCs/>
+        </w:rPr>
+        <w:t xml:space="preserve">{{END:ANNEX_HAS_VALUES}}</w:t>
       </w:r>
     </w:p>
     <w:p>

</xml_diff>

<commit_message>
Freebuff: FINAL TEMPLATE HANDOFF — WORD TEMPLATE IS THE SOURCE OF T...
</commit_message>
<xml_diff>
--- a/public/templates/heshiis_kiro_template_v2.docx
+++ b/public/templates/heshiis_kiro_template_v2.docx
@@ -875,460 +875,6 @@
       </w:pPr>
       <w:r>
         <w:t xml:space="preserve">{{DHERAAD_SHURUUDO}}</w:t>
-      </w:r>
-    </w:p>
-    <w:p>
-      <w:pPr>
-        <w:spacing w:after="80"/>
-      </w:pPr>
-      <w:r>
-        <w:rPr>
-          <w:b/>
-          <w:bCs/>
-        </w:rPr>
-        <w:t xml:space="preserve">{{IF:ANNEX_HAS_VALUES}}</w:t>
-      </w:r>
-    </w:p>
-    <w:p>
-      <w:pPr>
-        <w:spacing w:after="140" w:before="200"/>
-        <w:jc w:val="center"/>
-      </w:pPr>
-      <w:r>
-        <w:rPr>
-          <w:b/>
-          <w:bCs/>
-          <w:sz w:val="24"/>
-          <w:szCs w:val="24"/>
-          <w:u w:val="single"/>
-        </w:rPr>
-        <w:t xml:space="preserve">XOGTA HESHIISKA</w:t>
-      </w:r>
-    </w:p>
-    <w:p>
-      <w:pPr>
-        <w:spacing w:after="80"/>
-      </w:pPr>
-      <w:r>
-        <w:rPr>
-          <w:b/>
-          <w:bCs/>
-        </w:rPr>
-        <w:t xml:space="preserve">{{IF:ANNEX_BANGIGA}}</w:t>
-      </w:r>
-    </w:p>
-    <w:p>
-      <w:pPr>
-        <w:spacing w:after="120" w:line="300"/>
-        <w:jc w:val="both"/>
-      </w:pPr>
-      <w:r>
-        <w:t xml:space="preserve">Magaca Bangiga: {{BANGIGA_MAGACA}}</w:t>
-      </w:r>
-    </w:p>
-    <w:p>
-      <w:pPr>
-        <w:spacing w:after="120" w:line="300"/>
-        <w:jc w:val="both"/>
-      </w:pPr>
-      <w:r>
-        <w:t xml:space="preserve">Nambarka Xisaabta: {{BANGIGA_HISAABKA}}</w:t>
-      </w:r>
-    </w:p>
-    <w:p>
-      <w:pPr>
-        <w:spacing w:after="80"/>
-      </w:pPr>
-      <w:r>
-        <w:rPr>
-          <w:b/>
-          <w:bCs/>
-        </w:rPr>
-        <w:t xml:space="preserve">{{END:ANNEX_BANGIGA}}</w:t>
-      </w:r>
-    </w:p>
-    <w:p>
-      <w:pPr>
-        <w:spacing w:after="80"/>
-      </w:pPr>
-      <w:r>
-        <w:rPr>
-          <w:b/>
-          <w:bCs/>
-        </w:rPr>
-        <w:t xml:space="preserve">{{IF:ANNEX_HADSHAN}}</w:t>
-      </w:r>
-    </w:p>
-    <w:p>
-      <w:pPr>
-        <w:spacing w:after="120" w:line="300"/>
-        <w:jc w:val="both"/>
-      </w:pPr>
-      <w:r>
-        <w:t xml:space="preserve">Lacagta Hadhsan: {{LACAGTA_HADSHAN}}</w:t>
-      </w:r>
-    </w:p>
-    <w:p>
-      <w:pPr>
-        <w:spacing w:after="80"/>
-      </w:pPr>
-      <w:r>
-        <w:rPr>
-          <w:b/>
-          <w:bCs/>
-        </w:rPr>
-        <w:t xml:space="preserve">{{END:ANNEX_HADSHAN}}</w:t>
-      </w:r>
-    </w:p>
-    <w:p>
-      <w:pPr>
-        <w:spacing w:after="80"/>
-      </w:pPr>
-      <w:r>
-        <w:rPr>
-          <w:b/>
-          <w:bCs/>
-        </w:rPr>
-        <w:t xml:space="preserve">{{IF:ANNEX_BIXINTA}}</w:t>
-      </w:r>
-    </w:p>
-    <w:p>
-      <w:pPr>
-        <w:spacing w:after="120" w:line="300"/>
-        <w:jc w:val="both"/>
-      </w:pPr>
-      <w:r>
-        <w:t xml:space="preserve">Maalinta Bixinta: {{MUDDADA_BIXINTA}}</w:t>
-      </w:r>
-    </w:p>
-    <w:p>
-      <w:pPr>
-        <w:spacing w:after="120" w:line="300"/>
-        <w:jc w:val="both"/>
-      </w:pPr>
-      <w:r>
-        <w:t xml:space="preserve">Xaaladda Bixinta: {{BIXINTA_HORE}}</w:t>
-      </w:r>
-    </w:p>
-    <w:p>
-      <w:pPr>
-        <w:spacing w:after="80"/>
-      </w:pPr>
-      <w:r>
-        <w:rPr>
-          <w:b/>
-          <w:bCs/>
-        </w:rPr>
-        <w:t xml:space="preserve">{{END:ANNEX_BIXINTA}}</w:t>
-      </w:r>
-    </w:p>
-    <w:p>
-      <w:pPr>
-        <w:spacing w:after="80"/>
-      </w:pPr>
-      <w:r>
-        <w:rPr>
-          <w:b/>
-          <w:bCs/>
-        </w:rPr>
-        <w:t xml:space="preserve">{{IF:ANNEX_CINWAAN}}</w:t>
-      </w:r>
-    </w:p>
-    <w:p>
-      <w:pPr>
-        <w:spacing w:after="120" w:line="300"/>
-        <w:jc w:val="both"/>
-      </w:pPr>
-      <w:r>
-        <w:t xml:space="preserve">Cinwaanka Guriga: {{GURI_CINWAAN}}</w:t>
-      </w:r>
-    </w:p>
-    <w:p>
-      <w:pPr>
-        <w:spacing w:after="80"/>
-      </w:pPr>
-      <w:r>
-        <w:rPr>
-          <w:b/>
-          <w:bCs/>
-        </w:rPr>
-        <w:t xml:space="preserve">{{END:ANNEX_CINWAAN}}</w:t>
-      </w:r>
-    </w:p>
-    <w:p>
-      <w:pPr>
-        <w:spacing w:after="80"/>
-      </w:pPr>
-      <w:r>
-        <w:rPr>
-          <w:b/>
-          <w:bCs/>
-        </w:rPr>
-        <w:t xml:space="preserve">{{IF:ANNEX_QOLADA}}</w:t>
-      </w:r>
-    </w:p>
-    <w:p>
-      <w:pPr>
-        <w:spacing w:after="120" w:line="300"/>
-        <w:jc w:val="both"/>
-      </w:pPr>
-      <w:r>
-        <w:t xml:space="preserve">Qolada: {{GURI_QOLADA}}</w:t>
-      </w:r>
-    </w:p>
-    <w:p>
-      <w:pPr>
-        <w:spacing w:after="80"/>
-      </w:pPr>
-      <w:r>
-        <w:rPr>
-          <w:b/>
-          <w:bCs/>
-        </w:rPr>
-        <w:t xml:space="preserve">{{END:ANNEX_QOLADA}}</w:t>
-      </w:r>
-    </w:p>
-    <w:p>
-      <w:pPr>
-        <w:spacing w:after="80"/>
-      </w:pPr>
-      <w:r>
-        <w:rPr>
-          <w:b/>
-          <w:bCs/>
-        </w:rPr>
-        <w:t xml:space="preserve">{{IF:ANNEX_SHURUUDAHA}}</w:t>
-      </w:r>
-    </w:p>
-    <w:p>
-      <w:pPr>
-        <w:spacing w:after="120" w:line="300"/>
-        <w:jc w:val="both"/>
-      </w:pPr>
-      <w:r>
-        <w:t xml:space="preserve">Shuruudaha Gaarka ah: {{SHURUUDAHA_GAARKA_AH}}</w:t>
-      </w:r>
-    </w:p>
-    <w:p>
-      <w:pPr>
-        <w:spacing w:after="80"/>
-      </w:pPr>
-      <w:r>
-        <w:rPr>
-          <w:b/>
-          <w:bCs/>
-        </w:rPr>
-        <w:t xml:space="preserve">{{END:ANNEX_SHURUUDAHA}}</w:t>
-      </w:r>
-    </w:p>
-    <w:p>
-      <w:pPr>
-        <w:spacing w:after="80"/>
-      </w:pPr>
-      <w:r>
-        <w:rPr>
-          <w:b/>
-          <w:bCs/>
-        </w:rPr>
-        <w:t xml:space="preserve">{{IF:ANNEX_DEEBAAJI}}</w:t>
-      </w:r>
-    </w:p>
-    <w:p>
-      <w:pPr>
-        <w:spacing w:after="120" w:line="300"/>
-        <w:jc w:val="both"/>
-      </w:pPr>
-      <w:r>
-        <w:t xml:space="preserve">Shuruudaha Deebaajiga: {{DEEBAAJI_SHURUUDO}}</w:t>
-      </w:r>
-    </w:p>
-    <w:p>
-      <w:pPr>
-        <w:spacing w:after="80"/>
-      </w:pPr>
-      <w:r>
-        <w:rPr>
-          <w:b/>
-          <w:bCs/>
-        </w:rPr>
-        <w:t xml:space="preserve">{{END:ANNEX_DEEBAAJI}}</w:t>
-      </w:r>
-    </w:p>
-    <w:p>
-      <w:pPr>
-        <w:spacing w:after="80"/>
-      </w:pPr>
-      <w:r>
-        <w:rPr>
-          <w:b/>
-          <w:bCs/>
-        </w:rPr>
-        <w:t xml:space="preserve">{{IF:ANNEX_DAMIIN_AQOONSI}}</w:t>
-      </w:r>
-    </w:p>
-    <w:p>
-      <w:pPr>
-        <w:spacing w:after="120" w:line="300"/>
-        <w:jc w:val="both"/>
-      </w:pPr>
-      <w:r>
-        <w:t xml:space="preserve">Aqoonsiga Damiinka: {{DAMIIN_AQOONSI}}</w:t>
-      </w:r>
-    </w:p>
-    <w:p>
-      <w:pPr>
-        <w:spacing w:after="80"/>
-      </w:pPr>
-      <w:r>
-        <w:rPr>
-          <w:b/>
-          <w:bCs/>
-        </w:rPr>
-        <w:t xml:space="preserve">{{END:ANNEX_DAMIIN_AQOONSI}}</w:t>
-      </w:r>
-    </w:p>
-    <w:p>
-      <w:pPr>
-        <w:spacing w:after="80"/>
-      </w:pPr>
-      <w:r>
-        <w:rPr>
-          <w:b/>
-          <w:bCs/>
-        </w:rPr>
-        <w:t xml:space="preserve">{{IF:ANNEX_DAMIIN_CINWAAN}}</w:t>
-      </w:r>
-    </w:p>
-    <w:p>
-      <w:pPr>
-        <w:spacing w:after="120" w:line="300"/>
-        <w:jc w:val="both"/>
-      </w:pPr>
-      <w:r>
-        <w:t xml:space="preserve">Cinwaanka Damiinka: {{DAMIIN_CINWAAN}}</w:t>
-      </w:r>
-    </w:p>
-    <w:p>
-      <w:pPr>
-        <w:spacing w:after="80"/>
-      </w:pPr>
-      <w:r>
-        <w:rPr>
-          <w:b/>
-          <w:bCs/>
-        </w:rPr>
-        <w:t xml:space="preserve">{{END:ANNEX_DAMIIN_CINWAAN}}</w:t>
-      </w:r>
-    </w:p>
-    <w:p>
-      <w:pPr>
-        <w:spacing w:after="80"/>
-      </w:pPr>
-      <w:r>
-        <w:rPr>
-          <w:b/>
-          <w:bCs/>
-        </w:rPr>
-        <w:t xml:space="preserve">{{IF:ANNEX_OGAYSIIN_MUDADA}}</w:t>
-      </w:r>
-    </w:p>
-    <w:p>
-      <w:pPr>
-        <w:spacing w:after="120" w:line="300"/>
-        <w:jc w:val="both"/>
-      </w:pPr>
-      <w:r>
-        <w:t xml:space="preserve">Mudada Ogaysiinta: {{OGAYSIIN_MUDADA}}</w:t>
-      </w:r>
-    </w:p>
-    <w:p>
-      <w:pPr>
-        <w:spacing w:after="80"/>
-      </w:pPr>
-      <w:r>
-        <w:rPr>
-          <w:b/>
-          <w:bCs/>
-        </w:rPr>
-        <w:t xml:space="preserve">{{END:ANNEX_OGAYSIIN_MUDADA}}</w:t>
-      </w:r>
-    </w:p>
-    <w:p>
-      <w:pPr>
-        <w:spacing w:after="80"/>
-      </w:pPr>
-      <w:r>
-        <w:rPr>
-          <w:b/>
-          <w:bCs/>
-        </w:rPr>
-        <w:t xml:space="preserve">{{IF:ANNEX_OGAYSIIN_SHURUUDO}}</w:t>
-      </w:r>
-    </w:p>
-    <w:p>
-      <w:pPr>
-        <w:spacing w:after="120" w:line="300"/>
-        <w:jc w:val="both"/>
-      </w:pPr>
-      <w:r>
-        <w:t xml:space="preserve">Shuruudaha Joojinta: {{OGAYSIIN_SHURUUDAH}}</w:t>
-      </w:r>
-    </w:p>
-    <w:p>
-      <w:pPr>
-        <w:spacing w:after="80"/>
-      </w:pPr>
-      <w:r>
-        <w:rPr>
-          <w:b/>
-          <w:bCs/>
-        </w:rPr>
-        <w:t xml:space="preserve">{{END:ANNEX_OGAYSIIN_SHURUUDO}}</w:t>
-      </w:r>
-    </w:p>
-    <w:p>
-      <w:pPr>
-        <w:spacing w:after="80"/>
-      </w:pPr>
-      <w:r>
-        <w:rPr>
-          <w:b/>
-          <w:bCs/>
-        </w:rPr>
-        <w:t xml:space="preserve">{{IF:ANNEX_OGAYSIIN_FAAHFAAHIN}}</w:t>
-      </w:r>
-    </w:p>
-    <w:p>
-      <w:pPr>
-        <w:spacing w:after="120" w:line="300"/>
-        <w:jc w:val="both"/>
-      </w:pPr>
-      <w:r>
-        <w:t xml:space="preserve">Faahfaahin Ogaysiin: {{OGAYSIIN_FAAHFAAHIN}}</w:t>
-      </w:r>
-    </w:p>
-    <w:p>
-      <w:pPr>
-        <w:spacing w:after="80"/>
-      </w:pPr>
-      <w:r>
-        <w:rPr>
-          <w:b/>
-          <w:bCs/>
-        </w:rPr>
-        <w:t xml:space="preserve">{{END:ANNEX_OGAYSIIN_FAAHFAAHIN}}</w:t>
-      </w:r>
-    </w:p>
-    <w:p>
-      <w:pPr>
-        <w:spacing w:after="80"/>
-      </w:pPr>
-      <w:r>
-        <w:rPr>
-          <w:b/>
-          <w:bCs/>
-        </w:rPr>
-        <w:t xml:space="preserve">{{END:ANNEX_HAS_VALUES}}</w:t>
       </w:r>
     </w:p>
     <w:p>

</xml_diff>